<commit_message>
Refactor Threat Assessment Scoring script to improve score calculation and explanation generation
- Updated the scoring logic to prioritize 'PRISM_Score_Final' and 'Severity_Final' values when available.
- Enhanced the explanation generation by incorporating final score and severity values for better clarity.
- Reintroduced the application of the explanation function to the scored DataFrame for comprehensive output.

Made-with: Cursor
</commit_message>
<xml_diff>
--- a/documentation/SOP/DOCX_v11/SOP_Daily_Reports_Consolidation.docx
+++ b/documentation/SOP/DOCX_v11/SOP_Daily_Reports_Consolidation.docx
@@ -17,7 +17,7 @@
         <mc:AlternateContent>
           <mc:Choice Requires="wps">
             <w:drawing>
-              <wp:anchor distT="0" distB="0" distL="114300" distR="114300" simplePos="0" relativeHeight="251662337" behindDoc="0" locked="0" layoutInCell="1" allowOverlap="1" wp14:anchorId="2B62686E" wp14:editId="794D0CF0">
+              <wp:anchor distT="0" distB="0" distL="114300" distR="114300" simplePos="0" relativeHeight="251662337" behindDoc="0" locked="0" layoutInCell="1" allowOverlap="1" wp14:anchorId="0CE84385" wp14:editId="45730FB8">
                 <wp:simplePos x="0" y="0"/>
                 <wp:positionH relativeFrom="column">
                   <wp:posOffset>-914400</wp:posOffset>
@@ -53,6 +53,7 @@
                             <w:pPr>
                               <w:jc w:val="center"/>
                             </w:pPr>
+                            <w:proofErr w:type="gramStart"/>
                             <w:r>
                               <w:rPr>
                                 <w:rFonts w:ascii="Poppins ExtraBold" w:hAnsi="Poppins ExtraBold" w:cs="Poppins ExtraBold"/>
@@ -60,6 +61,7 @@
                               </w:rPr>
                               <w:t>TLP:AMBER</w:t>
                             </w:r>
+                            <w:proofErr w:type="gramEnd"/>
                           </w:p>
                         </w:txbxContent>
                       </wps:txbx>
@@ -117,7 +119,7 @@
           <w:sz w:val="56"/>
         </w:rPr>
         <w:drawing>
-          <wp:anchor distT="0" distB="0" distL="114300" distR="114300" simplePos="0" relativeHeight="251658241" behindDoc="0" locked="0" layoutInCell="1" allowOverlap="1" wp14:anchorId="1BF6503F" wp14:editId="53713A81">
+          <wp:anchor distT="0" distB="0" distL="114300" distR="114300" simplePos="0" relativeHeight="251658241" behindDoc="0" locked="0" layoutInCell="1" allowOverlap="1" wp14:anchorId="6A2EEDD8" wp14:editId="256755CE">
             <wp:simplePos x="0" y="0"/>
             <wp:positionH relativeFrom="margin">
               <wp:posOffset>0</wp:posOffset>
@@ -192,7 +194,7 @@
         <mc:AlternateContent>
           <mc:Choice Requires="wps">
             <w:drawing>
-              <wp:anchor distT="0" distB="0" distL="114300" distR="114300" simplePos="0" relativeHeight="251658240" behindDoc="1" locked="1" layoutInCell="1" allowOverlap="1" wp14:anchorId="39DE5ADA" wp14:editId="22503DEE">
+              <wp:anchor distT="0" distB="0" distL="114300" distR="114300" simplePos="0" relativeHeight="251658240" behindDoc="1" locked="1" layoutInCell="1" allowOverlap="1" wp14:anchorId="08538D9D" wp14:editId="086C8858">
                 <wp:simplePos x="0" y="0"/>
                 <wp:positionH relativeFrom="page">
                   <wp:posOffset>0</wp:posOffset>
@@ -308,7 +310,7 @@
           <w:szCs w:val="56"/>
         </w:rPr>
         <w:drawing>
-          <wp:anchor distT="0" distB="0" distL="114300" distR="114300" simplePos="0" relativeHeight="251660289" behindDoc="0" locked="0" layoutInCell="1" allowOverlap="1" wp14:anchorId="7B649A0A" wp14:editId="5D7675E1">
+          <wp:anchor distT="0" distB="0" distL="114300" distR="114300" simplePos="0" relativeHeight="251660289" behindDoc="0" locked="0" layoutInCell="1" allowOverlap="1" wp14:anchorId="46B7564F" wp14:editId="0276F356">
             <wp:simplePos x="0" y="0"/>
             <wp:positionH relativeFrom="column">
               <wp:posOffset>104774</wp:posOffset>
@@ -401,7 +403,7 @@
         <mc:AlternateContent>
           <mc:Choice Requires="wps">
             <w:drawing>
-              <wp:anchor distT="0" distB="0" distL="114300" distR="114300" simplePos="0" relativeHeight="251661313" behindDoc="0" locked="0" layoutInCell="1" allowOverlap="1" wp14:anchorId="24952982" wp14:editId="096621DE">
+              <wp:anchor distT="0" distB="0" distL="114300" distR="114300" simplePos="0" relativeHeight="251661313" behindDoc="0" locked="0" layoutInCell="1" allowOverlap="1" wp14:anchorId="2861ED88" wp14:editId="4FE2323B">
                 <wp:simplePos x="0" y="0"/>
                 <wp:positionH relativeFrom="column">
                   <wp:posOffset>0</wp:posOffset>
@@ -560,8 +562,6 @@
       </w:pPr>
       <w:r>
         <w:t>Version 1.0</w:t>
-      </w:r>
-      <w:r>
         <w:br/>
         <w:t>April 2026</w:t>
       </w:r>
@@ -603,7 +603,491 @@
             <w:t>ts</w:t>
           </w:r>
         </w:p>
-        <w:p/>
+        <w:p>
+          <w:pPr>
+            <w:pStyle w:val="TOC2"/>
+            <w:rPr>
+              <w:rFonts w:asciiTheme="minorHAnsi" w:eastAsiaTheme="minorEastAsia" w:hAnsiTheme="minorHAnsi" w:cstheme="minorBidi"/>
+              <w:b w:val="0"/>
+              <w:i w:val="0"/>
+              <w:iCs w:val="0"/>
+              <w:noProof/>
+              <w:color w:val="auto"/>
+              <w:kern w:val="2"/>
+              <w:sz w:val="24"/>
+              <w:szCs w:val="24"/>
+              <w14:ligatures w14:val="standardContextual"/>
+            </w:rPr>
+          </w:pPr>
+          <w:r>
+            <w:rPr>
+              <w:rFonts w:ascii="Nirmala UI" w:hAnsi="Nirmala UI" w:cs="Nirmala UI"/>
+              <w:i w:val="0"/>
+              <w:iCs w:val="0"/>
+            </w:rPr>
+            <w:fldChar w:fldCharType="begin"/>
+          </w:r>
+          <w:r>
+            <w:rPr>
+              <w:rFonts w:ascii="Nirmala UI" w:hAnsi="Nirmala UI" w:cs="Nirmala UI"/>
+              <w:i w:val="0"/>
+              <w:iCs w:val="0"/>
+            </w:rPr>
+            <w:instrText xml:space="preserve"> TOC \o "1-3" \h \z \u </w:instrText>
+          </w:r>
+          <w:r>
+            <w:rPr>
+              <w:rFonts w:ascii="Nirmala UI" w:hAnsi="Nirmala UI" w:cs="Nirmala UI"/>
+              <w:i w:val="0"/>
+              <w:iCs w:val="0"/>
+            </w:rPr>
+            <w:fldChar w:fldCharType="separate"/>
+          </w:r>
+          <w:hyperlink w:anchor="_Toc225922823" w:history="1">
+            <w:r>
+              <w:rPr>
+                <w:rStyle w:val="Hyperlink"/>
+                <w:rFonts w:ascii="Nirmala UI" w:hAnsi="Nirmala UI" w:cs="Nirmala UI"/>
+                <w:noProof/>
+              </w:rPr>
+              <w:t>Purpose</w:t>
+            </w:r>
+            <w:r>
+              <w:rPr>
+                <w:noProof/>
+                <w:webHidden/>
+              </w:rPr>
+              <w:tab/>
+            </w:r>
+            <w:r>
+              <w:rPr>
+                <w:noProof/>
+                <w:webHidden/>
+              </w:rPr>
+              <w:fldChar w:fldCharType="begin"/>
+            </w:r>
+            <w:r>
+              <w:rPr>
+                <w:noProof/>
+                <w:webHidden/>
+              </w:rPr>
+              <w:instrText xml:space="preserve"> PAGEREF _Toc225922823 \h </w:instrText>
+            </w:r>
+            <w:r>
+              <w:rPr>
+                <w:noProof/>
+                <w:webHidden/>
+              </w:rPr>
+            </w:r>
+            <w:r>
+              <w:rPr>
+                <w:noProof/>
+                <w:webHidden/>
+              </w:rPr>
+              <w:fldChar w:fldCharType="separate"/>
+            </w:r>
+            <w:r>
+              <w:rPr>
+                <w:noProof/>
+                <w:webHidden/>
+              </w:rPr>
+              <w:t>3</w:t>
+            </w:r>
+            <w:r>
+              <w:rPr>
+                <w:noProof/>
+                <w:webHidden/>
+              </w:rPr>
+              <w:fldChar w:fldCharType="end"/>
+            </w:r>
+          </w:hyperlink>
+        </w:p>
+        <w:p>
+          <w:pPr>
+            <w:pStyle w:val="TOC2"/>
+            <w:rPr>
+              <w:rFonts w:asciiTheme="minorHAnsi" w:eastAsiaTheme="minorEastAsia" w:hAnsiTheme="minorHAnsi" w:cstheme="minorBidi"/>
+              <w:b w:val="0"/>
+              <w:i w:val="0"/>
+              <w:iCs w:val="0"/>
+              <w:noProof/>
+              <w:color w:val="auto"/>
+              <w:kern w:val="2"/>
+              <w:sz w:val="24"/>
+              <w:szCs w:val="24"/>
+              <w14:ligatures w14:val="standardContextual"/>
+            </w:rPr>
+          </w:pPr>
+          <w:hyperlink w:anchor="_Toc225922824" w:history="1">
+            <w:r>
+              <w:rPr>
+                <w:rStyle w:val="Hyperlink"/>
+                <w:rFonts w:ascii="Nirmala UI" w:hAnsi="Nirmala UI" w:cs="Nirmala UI"/>
+                <w:noProof/>
+              </w:rPr>
+              <w:t>Phase 1: Production and Initial Review</w:t>
+            </w:r>
+            <w:r>
+              <w:rPr>
+                <w:noProof/>
+                <w:webHidden/>
+              </w:rPr>
+              <w:tab/>
+            </w:r>
+            <w:r>
+              <w:rPr>
+                <w:noProof/>
+                <w:webHidden/>
+              </w:rPr>
+              <w:fldChar w:fldCharType="begin"/>
+            </w:r>
+            <w:r>
+              <w:rPr>
+                <w:noProof/>
+                <w:webHidden/>
+              </w:rPr>
+              <w:instrText xml:space="preserve"> PAGEREF _Toc225922824 \h </w:instrText>
+            </w:r>
+            <w:r>
+              <w:rPr>
+                <w:noProof/>
+                <w:webHidden/>
+              </w:rPr>
+            </w:r>
+            <w:r>
+              <w:rPr>
+                <w:noProof/>
+                <w:webHidden/>
+              </w:rPr>
+              <w:fldChar w:fldCharType="separate"/>
+            </w:r>
+            <w:r>
+              <w:rPr>
+                <w:noProof/>
+                <w:webHidden/>
+              </w:rPr>
+              <w:t>3</w:t>
+            </w:r>
+            <w:r>
+              <w:rPr>
+                <w:noProof/>
+                <w:webHidden/>
+              </w:rPr>
+              <w:fldChar w:fldCharType="end"/>
+            </w:r>
+          </w:hyperlink>
+        </w:p>
+        <w:p>
+          <w:pPr>
+            <w:pStyle w:val="TOC2"/>
+            <w:rPr>
+              <w:rFonts w:asciiTheme="minorHAnsi" w:eastAsiaTheme="minorEastAsia" w:hAnsiTheme="minorHAnsi" w:cstheme="minorBidi"/>
+              <w:b w:val="0"/>
+              <w:i w:val="0"/>
+              <w:iCs w:val="0"/>
+              <w:noProof/>
+              <w:color w:val="auto"/>
+              <w:kern w:val="2"/>
+              <w:sz w:val="24"/>
+              <w:szCs w:val="24"/>
+              <w14:ligatures w14:val="standardContextual"/>
+            </w:rPr>
+          </w:pPr>
+          <w:hyperlink w:anchor="_Toc225922825" w:history="1">
+            <w:r>
+              <w:rPr>
+                <w:rStyle w:val="Hyperlink"/>
+                <w:rFonts w:ascii="Nirmala UI" w:hAnsi="Nirmala UI" w:cs="Nirmala UI"/>
+                <w:noProof/>
+              </w:rPr>
+              <w:t>Phase 2: Finalization and Conversion</w:t>
+            </w:r>
+            <w:r>
+              <w:rPr>
+                <w:noProof/>
+                <w:webHidden/>
+              </w:rPr>
+              <w:tab/>
+            </w:r>
+            <w:r>
+              <w:rPr>
+                <w:noProof/>
+                <w:webHidden/>
+              </w:rPr>
+              <w:fldChar w:fldCharType="begin"/>
+            </w:r>
+            <w:r>
+              <w:rPr>
+                <w:noProof/>
+                <w:webHidden/>
+              </w:rPr>
+              <w:instrText xml:space="preserve"> PAGEREF _Toc225922825 \h </w:instrText>
+            </w:r>
+            <w:r>
+              <w:rPr>
+                <w:noProof/>
+                <w:webHidden/>
+              </w:rPr>
+            </w:r>
+            <w:r>
+              <w:rPr>
+                <w:noProof/>
+                <w:webHidden/>
+              </w:rPr>
+              <w:fldChar w:fldCharType="separate"/>
+            </w:r>
+            <w:r>
+              <w:rPr>
+                <w:noProof/>
+                <w:webHidden/>
+              </w:rPr>
+              <w:t>3</w:t>
+            </w:r>
+            <w:r>
+              <w:rPr>
+                <w:noProof/>
+                <w:webHidden/>
+              </w:rPr>
+              <w:fldChar w:fldCharType="end"/>
+            </w:r>
+          </w:hyperlink>
+        </w:p>
+        <w:p>
+          <w:pPr>
+            <w:pStyle w:val="TOC2"/>
+            <w:rPr>
+              <w:rFonts w:asciiTheme="minorHAnsi" w:eastAsiaTheme="minorEastAsia" w:hAnsiTheme="minorHAnsi" w:cstheme="minorBidi"/>
+              <w:b w:val="0"/>
+              <w:i w:val="0"/>
+              <w:iCs w:val="0"/>
+              <w:noProof/>
+              <w:color w:val="auto"/>
+              <w:kern w:val="2"/>
+              <w:sz w:val="24"/>
+              <w:szCs w:val="24"/>
+              <w14:ligatures w14:val="standardContextual"/>
+            </w:rPr>
+          </w:pPr>
+          <w:hyperlink w:anchor="_Toc225922826" w:history="1">
+            <w:r>
+              <w:rPr>
+                <w:rStyle w:val="Hyperlink"/>
+                <w:rFonts w:ascii="Nirmala UI" w:hAnsi="Nirmala UI" w:cs="Nirmala UI"/>
+                <w:noProof/>
+              </w:rPr>
+              <w:t>Phase 3: Peer Review and Email Distribution</w:t>
+            </w:r>
+            <w:r>
+              <w:rPr>
+                <w:noProof/>
+                <w:webHidden/>
+              </w:rPr>
+              <w:tab/>
+            </w:r>
+            <w:r>
+              <w:rPr>
+                <w:noProof/>
+                <w:webHidden/>
+              </w:rPr>
+              <w:fldChar w:fldCharType="begin"/>
+            </w:r>
+            <w:r>
+              <w:rPr>
+                <w:noProof/>
+                <w:webHidden/>
+              </w:rPr>
+              <w:instrText xml:space="preserve"> PAGEREF _Toc225922826 \h </w:instrText>
+            </w:r>
+            <w:r>
+              <w:rPr>
+                <w:noProof/>
+                <w:webHidden/>
+              </w:rPr>
+            </w:r>
+            <w:r>
+              <w:rPr>
+                <w:noProof/>
+                <w:webHidden/>
+              </w:rPr>
+              <w:fldChar w:fldCharType="separate"/>
+            </w:r>
+            <w:r>
+              <w:rPr>
+                <w:noProof/>
+                <w:webHidden/>
+              </w:rPr>
+              <w:t>3</w:t>
+            </w:r>
+            <w:r>
+              <w:rPr>
+                <w:noProof/>
+                <w:webHidden/>
+              </w:rPr>
+              <w:fldChar w:fldCharType="end"/>
+            </w:r>
+          </w:hyperlink>
+        </w:p>
+        <w:p>
+          <w:pPr>
+            <w:pStyle w:val="TOC2"/>
+            <w:rPr>
+              <w:rFonts w:asciiTheme="minorHAnsi" w:eastAsiaTheme="minorEastAsia" w:hAnsiTheme="minorHAnsi" w:cstheme="minorBidi"/>
+              <w:b w:val="0"/>
+              <w:i w:val="0"/>
+              <w:iCs w:val="0"/>
+              <w:noProof/>
+              <w:color w:val="auto"/>
+              <w:kern w:val="2"/>
+              <w:sz w:val="24"/>
+              <w:szCs w:val="24"/>
+              <w14:ligatures w14:val="standardContextual"/>
+            </w:rPr>
+          </w:pPr>
+          <w:hyperlink w:anchor="_Toc225922827" w:history="1">
+            <w:r>
+              <w:rPr>
+                <w:rStyle w:val="Hyperlink"/>
+                <w:rFonts w:ascii="Nirmala UI" w:hAnsi="Nirmala UI" w:cs="Nirmala UI"/>
+                <w:noProof/>
+              </w:rPr>
+              <w:t>Maintenance: Master Recipient List</w:t>
+            </w:r>
+            <w:r>
+              <w:rPr>
+                <w:noProof/>
+                <w:webHidden/>
+              </w:rPr>
+              <w:tab/>
+            </w:r>
+            <w:r>
+              <w:rPr>
+                <w:noProof/>
+                <w:webHidden/>
+              </w:rPr>
+              <w:fldChar w:fldCharType="begin"/>
+            </w:r>
+            <w:r>
+              <w:rPr>
+                <w:noProof/>
+                <w:webHidden/>
+              </w:rPr>
+              <w:instrText xml:space="preserve"> PAGEREF _Toc225922827 \h </w:instrText>
+            </w:r>
+            <w:r>
+              <w:rPr>
+                <w:noProof/>
+                <w:webHidden/>
+              </w:rPr>
+            </w:r>
+            <w:r>
+              <w:rPr>
+                <w:noProof/>
+                <w:webHidden/>
+              </w:rPr>
+              <w:fldChar w:fldCharType="separate"/>
+            </w:r>
+            <w:r>
+              <w:rPr>
+                <w:noProof/>
+                <w:webHidden/>
+              </w:rPr>
+              <w:t>5</w:t>
+            </w:r>
+            <w:r>
+              <w:rPr>
+                <w:noProof/>
+                <w:webHidden/>
+              </w:rPr>
+              <w:fldChar w:fldCharType="end"/>
+            </w:r>
+          </w:hyperlink>
+        </w:p>
+        <w:p>
+          <w:pPr>
+            <w:pStyle w:val="TOC2"/>
+            <w:rPr>
+              <w:rFonts w:asciiTheme="minorHAnsi" w:eastAsiaTheme="minorEastAsia" w:hAnsiTheme="minorHAnsi" w:cstheme="minorBidi"/>
+              <w:b w:val="0"/>
+              <w:i w:val="0"/>
+              <w:iCs w:val="0"/>
+              <w:noProof/>
+              <w:color w:val="auto"/>
+              <w:kern w:val="2"/>
+              <w:sz w:val="24"/>
+              <w:szCs w:val="24"/>
+              <w14:ligatures w14:val="standardContextual"/>
+            </w:rPr>
+          </w:pPr>
+          <w:hyperlink w:anchor="_Toc225922828" w:history="1">
+            <w:r>
+              <w:rPr>
+                <w:rStyle w:val="Hyperlink"/>
+                <w:rFonts w:ascii="Nirmala UI" w:hAnsi="Nirmala UI" w:cs="Nirmala UI"/>
+                <w:noProof/>
+              </w:rPr>
+              <w:t>Overview of Steps, Requirements, and Responsible Party</w:t>
+            </w:r>
+            <w:r>
+              <w:rPr>
+                <w:noProof/>
+                <w:webHidden/>
+              </w:rPr>
+              <w:tab/>
+            </w:r>
+            <w:r>
+              <w:rPr>
+                <w:noProof/>
+                <w:webHidden/>
+              </w:rPr>
+              <w:fldChar w:fldCharType="begin"/>
+            </w:r>
+            <w:r>
+              <w:rPr>
+                <w:noProof/>
+                <w:webHidden/>
+              </w:rPr>
+              <w:instrText xml:space="preserve"> PAGEREF _Toc225922828 \h </w:instrText>
+            </w:r>
+            <w:r>
+              <w:rPr>
+                <w:noProof/>
+                <w:webHidden/>
+              </w:rPr>
+            </w:r>
+            <w:r>
+              <w:rPr>
+                <w:noProof/>
+                <w:webHidden/>
+              </w:rPr>
+              <w:fldChar w:fldCharType="separate"/>
+            </w:r>
+            <w:r>
+              <w:rPr>
+                <w:noProof/>
+                <w:webHidden/>
+              </w:rPr>
+              <w:t>5</w:t>
+            </w:r>
+            <w:r>
+              <w:rPr>
+                <w:noProof/>
+                <w:webHidden/>
+              </w:rPr>
+              <w:fldChar w:fldCharType="end"/>
+            </w:r>
+          </w:hyperlink>
+        </w:p>
+        <w:p>
+          <w:r>
+            <w:rPr>
+              <w:rFonts w:ascii="Nirmala UI" w:hAnsi="Nirmala UI" w:cs="Nirmala UI"/>
+              <w:b/>
+              <w:bCs/>
+              <w:noProof/>
+            </w:rPr>
+            <w:fldChar w:fldCharType="end"/>
+          </w:r>
+        </w:p>
       </w:sdtContent>
     </w:sdt>
     <w:p>
@@ -615,1823 +1099,23 @@
       <w:pPr>
         <w:pStyle w:val="Heading1"/>
       </w:pPr>
-      <w:bookmarkStart w:id="0" w:name="_Toc228189858"/>
-      <w:r>
-        <w:lastRenderedPageBreak/>
+      <w:r>
         <w:t>Table of Contents</w:t>
       </w:r>
-      <w:bookmarkEnd w:id="0"/>
-    </w:p>
-    <w:p>
-      <w:pPr>
-        <w:pStyle w:val="TOC1"/>
-        <w:rPr>
-          <w:rFonts w:asciiTheme="minorHAnsi" w:eastAsiaTheme="minorEastAsia" w:hAnsiTheme="minorHAnsi" w:cstheme="minorBidi"/>
-          <w:b w:val="0"/>
-          <w:noProof/>
-          <w:color w:val="auto"/>
-          <w:kern w:val="2"/>
-          <w:sz w:val="24"/>
-          <w:szCs w:val="24"/>
-          <w14:ligatures w14:val="standardContextual"/>
-        </w:rPr>
-      </w:pPr>
+    </w:p>
+    <w:p>
       <w:r>
         <w:fldChar w:fldCharType="begin"/>
       </w:r>
       <w:r>
-        <w:instrText>TOC \o "1-3" \h \z \u</w:instrText>
+        <w:instrText xml:space="preserve">TOC \o "1-3" \h \z \u</w:instrText>
       </w:r>
       <w:r>
         <w:fldChar w:fldCharType="separate"/>
       </w:r>
-      <w:hyperlink w:anchor="_Toc228189858" w:history="1">
-        <w:r>
-          <w:rPr>
-            <w:rStyle w:val="Hyperlink"/>
-            <w:noProof/>
-          </w:rPr>
-          <w:t>Table of Contents</w:t>
-        </w:r>
-        <w:r>
-          <w:rPr>
-            <w:noProof/>
-            <w:webHidden/>
-          </w:rPr>
-          <w:tab/>
-        </w:r>
-        <w:r>
-          <w:rPr>
-            <w:noProof/>
-            <w:webHidden/>
-          </w:rPr>
-          <w:fldChar w:fldCharType="begin"/>
-        </w:r>
-        <w:r>
-          <w:rPr>
-            <w:noProof/>
-            <w:webHidden/>
-          </w:rPr>
-          <w:instrText xml:space="preserve"> PAGEREF _Toc228189858 \h </w:instrText>
-        </w:r>
-        <w:r>
-          <w:rPr>
-            <w:noProof/>
-            <w:webHidden/>
-          </w:rPr>
-        </w:r>
-        <w:r>
-          <w:rPr>
-            <w:noProof/>
-            <w:webHidden/>
-          </w:rPr>
-          <w:fldChar w:fldCharType="separate"/>
-        </w:r>
-        <w:r>
-          <w:rPr>
-            <w:noProof/>
-            <w:webHidden/>
-          </w:rPr>
-          <w:t>2</w:t>
-        </w:r>
-        <w:r>
-          <w:rPr>
-            <w:noProof/>
-            <w:webHidden/>
-          </w:rPr>
-          <w:fldChar w:fldCharType="end"/>
-        </w:r>
-      </w:hyperlink>
-    </w:p>
-    <w:p>
-      <w:pPr>
-        <w:pStyle w:val="TOC2"/>
-        <w:rPr>
-          <w:rFonts w:asciiTheme="minorHAnsi" w:eastAsiaTheme="minorEastAsia" w:hAnsiTheme="minorHAnsi" w:cstheme="minorBidi"/>
-          <w:b w:val="0"/>
-          <w:i w:val="0"/>
-          <w:iCs w:val="0"/>
-          <w:noProof/>
-          <w:color w:val="auto"/>
-          <w:kern w:val="2"/>
-          <w:sz w:val="24"/>
-          <w:szCs w:val="24"/>
-          <w14:ligatures w14:val="standardContextual"/>
-        </w:rPr>
-      </w:pPr>
-      <w:hyperlink w:anchor="_Toc228189859" w:history="1">
-        <w:r>
-          <w:rPr>
-            <w:rStyle w:val="Hyperlink"/>
-            <w:noProof/>
-          </w:rPr>
-          <w:t>1. Purpose</w:t>
-        </w:r>
-        <w:r>
-          <w:rPr>
-            <w:noProof/>
-            <w:webHidden/>
-          </w:rPr>
-          <w:tab/>
-        </w:r>
-        <w:r>
-          <w:rPr>
-            <w:noProof/>
-            <w:webHidden/>
-          </w:rPr>
-          <w:fldChar w:fldCharType="begin"/>
-        </w:r>
-        <w:r>
-          <w:rPr>
-            <w:noProof/>
-            <w:webHidden/>
-          </w:rPr>
-          <w:instrText xml:space="preserve"> PAGEREF _Toc228189859 \h </w:instrText>
-        </w:r>
-        <w:r>
-          <w:rPr>
-            <w:noProof/>
-            <w:webHidden/>
-          </w:rPr>
-        </w:r>
-        <w:r>
-          <w:rPr>
-            <w:noProof/>
-            <w:webHidden/>
-          </w:rPr>
-          <w:fldChar w:fldCharType="separate"/>
-        </w:r>
-        <w:r>
-          <w:rPr>
-            <w:noProof/>
-            <w:webHidden/>
-          </w:rPr>
-          <w:t>3</w:t>
-        </w:r>
-        <w:r>
-          <w:rPr>
-            <w:noProof/>
-            <w:webHidden/>
-          </w:rPr>
-          <w:fldChar w:fldCharType="end"/>
-        </w:r>
-      </w:hyperlink>
-    </w:p>
-    <w:p>
-      <w:pPr>
-        <w:pStyle w:val="TOC2"/>
-        <w:rPr>
-          <w:rFonts w:asciiTheme="minorHAnsi" w:eastAsiaTheme="minorEastAsia" w:hAnsiTheme="minorHAnsi" w:cstheme="minorBidi"/>
-          <w:b w:val="0"/>
-          <w:i w:val="0"/>
-          <w:iCs w:val="0"/>
-          <w:noProof/>
-          <w:color w:val="auto"/>
-          <w:kern w:val="2"/>
-          <w:sz w:val="24"/>
-          <w:szCs w:val="24"/>
-          <w14:ligatures w14:val="standardContextual"/>
-        </w:rPr>
-      </w:pPr>
-      <w:hyperlink w:anchor="_Toc228189860" w:history="1">
-        <w:r>
-          <w:rPr>
-            <w:rStyle w:val="Hyperlink"/>
-            <w:noProof/>
-          </w:rPr>
-          <w:t>2. Scope</w:t>
-        </w:r>
-        <w:r>
-          <w:rPr>
-            <w:noProof/>
-            <w:webHidden/>
-          </w:rPr>
-          <w:tab/>
-        </w:r>
-        <w:r>
-          <w:rPr>
-            <w:noProof/>
-            <w:webHidden/>
-          </w:rPr>
-          <w:fldChar w:fldCharType="begin"/>
-        </w:r>
-        <w:r>
-          <w:rPr>
-            <w:noProof/>
-            <w:webHidden/>
-          </w:rPr>
-          <w:instrText xml:space="preserve"> PAGEREF _Toc228189860 \h </w:instrText>
-        </w:r>
-        <w:r>
-          <w:rPr>
-            <w:noProof/>
-            <w:webHidden/>
-          </w:rPr>
-        </w:r>
-        <w:r>
-          <w:rPr>
-            <w:noProof/>
-            <w:webHidden/>
-          </w:rPr>
-          <w:fldChar w:fldCharType="separate"/>
-        </w:r>
-        <w:r>
-          <w:rPr>
-            <w:noProof/>
-            <w:webHidden/>
-          </w:rPr>
-          <w:t>3</w:t>
-        </w:r>
-        <w:r>
-          <w:rPr>
-            <w:noProof/>
-            <w:webHidden/>
-          </w:rPr>
-          <w:fldChar w:fldCharType="end"/>
-        </w:r>
-      </w:hyperlink>
-    </w:p>
-    <w:p>
-      <w:pPr>
-        <w:pStyle w:val="TOC2"/>
-        <w:rPr>
-          <w:rFonts w:asciiTheme="minorHAnsi" w:eastAsiaTheme="minorEastAsia" w:hAnsiTheme="minorHAnsi" w:cstheme="minorBidi"/>
-          <w:b w:val="0"/>
-          <w:i w:val="0"/>
-          <w:iCs w:val="0"/>
-          <w:noProof/>
-          <w:color w:val="auto"/>
-          <w:kern w:val="2"/>
-          <w:sz w:val="24"/>
-          <w:szCs w:val="24"/>
-          <w14:ligatures w14:val="standardContextual"/>
-        </w:rPr>
-      </w:pPr>
-      <w:hyperlink w:anchor="_Toc228189861" w:history="1">
-        <w:r>
-          <w:rPr>
-            <w:rStyle w:val="Hyperlink"/>
-            <w:noProof/>
-          </w:rPr>
-          <w:t>3. Prerequisites</w:t>
-        </w:r>
-        <w:r>
-          <w:rPr>
-            <w:noProof/>
-            <w:webHidden/>
-          </w:rPr>
-          <w:tab/>
-        </w:r>
-        <w:r>
-          <w:rPr>
-            <w:noProof/>
-            <w:webHidden/>
-          </w:rPr>
-          <w:fldChar w:fldCharType="begin"/>
-        </w:r>
-        <w:r>
-          <w:rPr>
-            <w:noProof/>
-            <w:webHidden/>
-          </w:rPr>
-          <w:instrText xml:space="preserve"> PAGEREF _Toc228189861 \h </w:instrText>
-        </w:r>
-        <w:r>
-          <w:rPr>
-            <w:noProof/>
-            <w:webHidden/>
-          </w:rPr>
-        </w:r>
-        <w:r>
-          <w:rPr>
-            <w:noProof/>
-            <w:webHidden/>
-          </w:rPr>
-          <w:fldChar w:fldCharType="separate"/>
-        </w:r>
-        <w:r>
-          <w:rPr>
-            <w:noProof/>
-            <w:webHidden/>
-          </w:rPr>
-          <w:t>4</w:t>
-        </w:r>
-        <w:r>
-          <w:rPr>
-            <w:noProof/>
-            <w:webHidden/>
-          </w:rPr>
-          <w:fldChar w:fldCharType="end"/>
-        </w:r>
-      </w:hyperlink>
-    </w:p>
-    <w:p>
-      <w:pPr>
-        <w:pStyle w:val="TOC3"/>
-        <w:rPr>
-          <w:rFonts w:eastAsiaTheme="minorEastAsia"/>
-          <w:noProof/>
-          <w:kern w:val="2"/>
-          <w:sz w:val="24"/>
-          <w:szCs w:val="24"/>
-          <w14:ligatures w14:val="standardContextual"/>
-        </w:rPr>
-      </w:pPr>
-      <w:hyperlink w:anchor="_Toc228189862" w:history="1">
-        <w:r>
-          <w:rPr>
-            <w:rStyle w:val="Hyperlink"/>
-            <w:noProof/>
-          </w:rPr>
-          <w:t>3.1 Environment</w:t>
-        </w:r>
-        <w:r>
-          <w:rPr>
-            <w:noProof/>
-            <w:webHidden/>
-          </w:rPr>
-          <w:tab/>
-        </w:r>
-        <w:r>
-          <w:rPr>
-            <w:noProof/>
-            <w:webHidden/>
-          </w:rPr>
-          <w:fldChar w:fldCharType="begin"/>
-        </w:r>
-        <w:r>
-          <w:rPr>
-            <w:noProof/>
-            <w:webHidden/>
-          </w:rPr>
-          <w:instrText xml:space="preserve"> PAGEREF _Toc228189862 \h </w:instrText>
-        </w:r>
-        <w:r>
-          <w:rPr>
-            <w:noProof/>
-            <w:webHidden/>
-          </w:rPr>
-        </w:r>
-        <w:r>
-          <w:rPr>
-            <w:noProof/>
-            <w:webHidden/>
-          </w:rPr>
-          <w:fldChar w:fldCharType="separate"/>
-        </w:r>
-        <w:r>
-          <w:rPr>
-            <w:noProof/>
-            <w:webHidden/>
-          </w:rPr>
-          <w:t>4</w:t>
-        </w:r>
-        <w:r>
-          <w:rPr>
-            <w:noProof/>
-            <w:webHidden/>
-          </w:rPr>
-          <w:fldChar w:fldCharType="end"/>
-        </w:r>
-      </w:hyperlink>
-    </w:p>
-    <w:p>
-      <w:pPr>
-        <w:pStyle w:val="TOC3"/>
-        <w:rPr>
-          <w:rFonts w:eastAsiaTheme="minorEastAsia"/>
-          <w:noProof/>
-          <w:kern w:val="2"/>
-          <w:sz w:val="24"/>
-          <w:szCs w:val="24"/>
-          <w14:ligatures w14:val="standardContextual"/>
-        </w:rPr>
-      </w:pPr>
-      <w:hyperlink w:anchor="_Toc228189863" w:history="1">
-        <w:r>
-          <w:rPr>
-            <w:rStyle w:val="Hyperlink"/>
-            <w:noProof/>
-          </w:rPr>
-          <w:t>3.2 Input Data</w:t>
-        </w:r>
-        <w:r>
-          <w:rPr>
-            <w:noProof/>
-            <w:webHidden/>
-          </w:rPr>
-          <w:tab/>
-        </w:r>
-        <w:r>
-          <w:rPr>
-            <w:noProof/>
-            <w:webHidden/>
-          </w:rPr>
-          <w:fldChar w:fldCharType="begin"/>
-        </w:r>
-        <w:r>
-          <w:rPr>
-            <w:noProof/>
-            <w:webHidden/>
-          </w:rPr>
-          <w:instrText xml:space="preserve"> PAGEREF _Toc228189863 \h </w:instrText>
-        </w:r>
-        <w:r>
-          <w:rPr>
-            <w:noProof/>
-            <w:webHidden/>
-          </w:rPr>
-        </w:r>
-        <w:r>
-          <w:rPr>
-            <w:noProof/>
-            <w:webHidden/>
-          </w:rPr>
-          <w:fldChar w:fldCharType="separate"/>
-        </w:r>
-        <w:r>
-          <w:rPr>
-            <w:noProof/>
-            <w:webHidden/>
-          </w:rPr>
-          <w:t>4</w:t>
-        </w:r>
-        <w:r>
-          <w:rPr>
-            <w:noProof/>
-            <w:webHidden/>
-          </w:rPr>
-          <w:fldChar w:fldCharType="end"/>
-        </w:r>
-      </w:hyperlink>
-    </w:p>
-    <w:p>
-      <w:pPr>
-        <w:pStyle w:val="TOC2"/>
-        <w:rPr>
-          <w:rFonts w:asciiTheme="minorHAnsi" w:eastAsiaTheme="minorEastAsia" w:hAnsiTheme="minorHAnsi" w:cstheme="minorBidi"/>
-          <w:b w:val="0"/>
-          <w:i w:val="0"/>
-          <w:iCs w:val="0"/>
-          <w:noProof/>
-          <w:color w:val="auto"/>
-          <w:kern w:val="2"/>
-          <w:sz w:val="24"/>
-          <w:szCs w:val="24"/>
-          <w14:ligatures w14:val="standardContextual"/>
-        </w:rPr>
-      </w:pPr>
-      <w:hyperlink w:anchor="_Toc228189864" w:history="1">
-        <w:r>
-          <w:rPr>
-            <w:rStyle w:val="Hyperlink"/>
-            <w:noProof/>
-          </w:rPr>
-          <w:t>4. Key Configuration</w:t>
-        </w:r>
-        <w:r>
-          <w:rPr>
-            <w:noProof/>
-            <w:webHidden/>
-          </w:rPr>
-          <w:tab/>
-        </w:r>
-        <w:r>
-          <w:rPr>
-            <w:noProof/>
-            <w:webHidden/>
-          </w:rPr>
-          <w:fldChar w:fldCharType="begin"/>
-        </w:r>
-        <w:r>
-          <w:rPr>
-            <w:noProof/>
-            <w:webHidden/>
-          </w:rPr>
-          <w:instrText xml:space="preserve"> PAGEREF _Toc228189864 \h </w:instrText>
-        </w:r>
-        <w:r>
-          <w:rPr>
-            <w:noProof/>
-            <w:webHidden/>
-          </w:rPr>
-        </w:r>
-        <w:r>
-          <w:rPr>
-            <w:noProof/>
-            <w:webHidden/>
-          </w:rPr>
-          <w:fldChar w:fldCharType="separate"/>
-        </w:r>
-        <w:r>
-          <w:rPr>
-            <w:noProof/>
-            <w:webHidden/>
-          </w:rPr>
-          <w:t>4</w:t>
-        </w:r>
-        <w:r>
-          <w:rPr>
-            <w:noProof/>
-            <w:webHidden/>
-          </w:rPr>
-          <w:fldChar w:fldCharType="end"/>
-        </w:r>
-      </w:hyperlink>
-    </w:p>
-    <w:p>
-      <w:pPr>
-        <w:pStyle w:val="TOC2"/>
-        <w:rPr>
-          <w:rFonts w:asciiTheme="minorHAnsi" w:eastAsiaTheme="minorEastAsia" w:hAnsiTheme="minorHAnsi" w:cstheme="minorBidi"/>
-          <w:b w:val="0"/>
-          <w:i w:val="0"/>
-          <w:iCs w:val="0"/>
-          <w:noProof/>
-          <w:color w:val="auto"/>
-          <w:kern w:val="2"/>
-          <w:sz w:val="24"/>
-          <w:szCs w:val="24"/>
-          <w14:ligatures w14:val="standardContextual"/>
-        </w:rPr>
-      </w:pPr>
-      <w:hyperlink w:anchor="_Toc228189865" w:history="1">
-        <w:r>
-          <w:rPr>
-            <w:rStyle w:val="Hyperlink"/>
-            <w:noProof/>
-          </w:rPr>
-          <w:t>5. How the Process Works</w:t>
-        </w:r>
-        <w:r>
-          <w:rPr>
-            <w:noProof/>
-            <w:webHidden/>
-          </w:rPr>
-          <w:tab/>
-        </w:r>
-        <w:r>
-          <w:rPr>
-            <w:noProof/>
-            <w:webHidden/>
-          </w:rPr>
-          <w:fldChar w:fldCharType="begin"/>
-        </w:r>
-        <w:r>
-          <w:rPr>
-            <w:noProof/>
-            <w:webHidden/>
-          </w:rPr>
-          <w:instrText xml:space="preserve"> PAGEREF _Toc228189865 \h </w:instrText>
-        </w:r>
-        <w:r>
-          <w:rPr>
-            <w:noProof/>
-            <w:webHidden/>
-          </w:rPr>
-        </w:r>
-        <w:r>
-          <w:rPr>
-            <w:noProof/>
-            <w:webHidden/>
-          </w:rPr>
-          <w:fldChar w:fldCharType="separate"/>
-        </w:r>
-        <w:r>
-          <w:rPr>
-            <w:noProof/>
-            <w:webHidden/>
-          </w:rPr>
-          <w:t>5</w:t>
-        </w:r>
-        <w:r>
-          <w:rPr>
-            <w:noProof/>
-            <w:webHidden/>
-          </w:rPr>
-          <w:fldChar w:fldCharType="end"/>
-        </w:r>
-      </w:hyperlink>
-    </w:p>
-    <w:p>
-      <w:pPr>
-        <w:pStyle w:val="TOC3"/>
-        <w:rPr>
-          <w:rFonts w:eastAsiaTheme="minorEastAsia"/>
-          <w:noProof/>
-          <w:kern w:val="2"/>
-          <w:sz w:val="24"/>
-          <w:szCs w:val="24"/>
-          <w14:ligatures w14:val="standardContextual"/>
-        </w:rPr>
-      </w:pPr>
-      <w:hyperlink w:anchor="_Toc228189866" w:history="1">
-        <w:r>
-          <w:rPr>
-            <w:rStyle w:val="Hyperlink"/>
-            <w:noProof/>
-          </w:rPr>
-          <w:t>5.1 File Discovery</w:t>
-        </w:r>
-        <w:r>
-          <w:rPr>
-            <w:noProof/>
-            <w:webHidden/>
-          </w:rPr>
-          <w:tab/>
-        </w:r>
-        <w:r>
-          <w:rPr>
-            <w:noProof/>
-            <w:webHidden/>
-          </w:rPr>
-          <w:fldChar w:fldCharType="begin"/>
-        </w:r>
-        <w:r>
-          <w:rPr>
-            <w:noProof/>
-            <w:webHidden/>
-          </w:rPr>
-          <w:instrText xml:space="preserve"> PAGEREF _Toc228189866 \h </w:instrText>
-        </w:r>
-        <w:r>
-          <w:rPr>
-            <w:noProof/>
-            <w:webHidden/>
-          </w:rPr>
-        </w:r>
-        <w:r>
-          <w:rPr>
-            <w:noProof/>
-            <w:webHidden/>
-          </w:rPr>
-          <w:fldChar w:fldCharType="separate"/>
-        </w:r>
-        <w:r>
-          <w:rPr>
-            <w:noProof/>
-            <w:webHidden/>
-          </w:rPr>
-          <w:t>5</w:t>
-        </w:r>
-        <w:r>
-          <w:rPr>
-            <w:noProof/>
-            <w:webHidden/>
-          </w:rPr>
-          <w:fldChar w:fldCharType="end"/>
-        </w:r>
-      </w:hyperlink>
-    </w:p>
-    <w:p>
-      <w:pPr>
-        <w:pStyle w:val="TOC3"/>
-        <w:rPr>
-          <w:rFonts w:eastAsiaTheme="minorEastAsia"/>
-          <w:noProof/>
-          <w:kern w:val="2"/>
-          <w:sz w:val="24"/>
-          <w:szCs w:val="24"/>
-          <w14:ligatures w14:val="standardContextual"/>
-        </w:rPr>
-      </w:pPr>
-      <w:hyperlink w:anchor="_Toc228189867" w:history="1">
-        <w:r>
-          <w:rPr>
-            <w:rStyle w:val="Hyperlink"/>
-            <w:noProof/>
-          </w:rPr>
-          <w:t>5.2 Consolidation</w:t>
-        </w:r>
-        <w:r>
-          <w:rPr>
-            <w:noProof/>
-            <w:webHidden/>
-          </w:rPr>
-          <w:tab/>
-        </w:r>
-        <w:r>
-          <w:rPr>
-            <w:noProof/>
-            <w:webHidden/>
-          </w:rPr>
-          <w:fldChar w:fldCharType="begin"/>
-        </w:r>
-        <w:r>
-          <w:rPr>
-            <w:noProof/>
-            <w:webHidden/>
-          </w:rPr>
-          <w:instrText xml:space="preserve"> PAGEREF _Toc228189867 \h </w:instrText>
-        </w:r>
-        <w:r>
-          <w:rPr>
-            <w:noProof/>
-            <w:webHidden/>
-          </w:rPr>
-        </w:r>
-        <w:r>
-          <w:rPr>
-            <w:noProof/>
-            <w:webHidden/>
-          </w:rPr>
-          <w:fldChar w:fldCharType="separate"/>
-        </w:r>
-        <w:r>
-          <w:rPr>
-            <w:noProof/>
-            <w:webHidden/>
-          </w:rPr>
-          <w:t>5</w:t>
-        </w:r>
-        <w:r>
-          <w:rPr>
-            <w:noProof/>
-            <w:webHidden/>
-          </w:rPr>
-          <w:fldChar w:fldCharType="end"/>
-        </w:r>
-      </w:hyperlink>
-    </w:p>
-    <w:p>
-      <w:pPr>
-        <w:pStyle w:val="TOC3"/>
-        <w:rPr>
-          <w:rFonts w:eastAsiaTheme="minorEastAsia"/>
-          <w:noProof/>
-          <w:kern w:val="2"/>
-          <w:sz w:val="24"/>
-          <w:szCs w:val="24"/>
-          <w14:ligatures w14:val="standardContextual"/>
-        </w:rPr>
-      </w:pPr>
-      <w:hyperlink w:anchor="_Toc228189868" w:history="1">
-        <w:r>
-          <w:rPr>
-            <w:rStyle w:val="Hyperlink"/>
-            <w:noProof/>
-          </w:rPr>
-          <w:t>5.3 Output</w:t>
-        </w:r>
-        <w:r>
-          <w:rPr>
-            <w:noProof/>
-            <w:webHidden/>
-          </w:rPr>
-          <w:tab/>
-        </w:r>
-        <w:r>
-          <w:rPr>
-            <w:noProof/>
-            <w:webHidden/>
-          </w:rPr>
-          <w:fldChar w:fldCharType="begin"/>
-        </w:r>
-        <w:r>
-          <w:rPr>
-            <w:noProof/>
-            <w:webHidden/>
-          </w:rPr>
-          <w:instrText xml:space="preserve"> PAGEREF _Toc228189868 \h </w:instrText>
-        </w:r>
-        <w:r>
-          <w:rPr>
-            <w:noProof/>
-            <w:webHidden/>
-          </w:rPr>
-        </w:r>
-        <w:r>
-          <w:rPr>
-            <w:noProof/>
-            <w:webHidden/>
-          </w:rPr>
-          <w:fldChar w:fldCharType="separate"/>
-        </w:r>
-        <w:r>
-          <w:rPr>
-            <w:noProof/>
-            <w:webHidden/>
-          </w:rPr>
-          <w:t>6</w:t>
-        </w:r>
-        <w:r>
-          <w:rPr>
-            <w:noProof/>
-            <w:webHidden/>
-          </w:rPr>
-          <w:fldChar w:fldCharType="end"/>
-        </w:r>
-      </w:hyperlink>
-    </w:p>
-    <w:p>
-      <w:pPr>
-        <w:pStyle w:val="TOC2"/>
-        <w:rPr>
-          <w:rFonts w:asciiTheme="minorHAnsi" w:eastAsiaTheme="minorEastAsia" w:hAnsiTheme="minorHAnsi" w:cstheme="minorBidi"/>
-          <w:b w:val="0"/>
-          <w:i w:val="0"/>
-          <w:iCs w:val="0"/>
-          <w:noProof/>
-          <w:color w:val="auto"/>
-          <w:kern w:val="2"/>
-          <w:sz w:val="24"/>
-          <w:szCs w:val="24"/>
-          <w14:ligatures w14:val="standardContextual"/>
-        </w:rPr>
-      </w:pPr>
-      <w:hyperlink w:anchor="_Toc228189869" w:history="1">
-        <w:r>
-          <w:rPr>
-            <w:rStyle w:val="Hyperlink"/>
-            <w:noProof/>
-          </w:rPr>
-          <w:t>6. Automated Execution (main.py)</w:t>
-        </w:r>
-        <w:r>
-          <w:rPr>
-            <w:noProof/>
-            <w:webHidden/>
-          </w:rPr>
-          <w:tab/>
-        </w:r>
-        <w:r>
-          <w:rPr>
-            <w:noProof/>
-            <w:webHidden/>
-          </w:rPr>
-          <w:fldChar w:fldCharType="begin"/>
-        </w:r>
-        <w:r>
-          <w:rPr>
-            <w:noProof/>
-            <w:webHidden/>
-          </w:rPr>
-          <w:instrText xml:space="preserve"> PAGEREF _Toc228189869 \h </w:instrText>
-        </w:r>
-        <w:r>
-          <w:rPr>
-            <w:noProof/>
-            <w:webHidden/>
-          </w:rPr>
-        </w:r>
-        <w:r>
-          <w:rPr>
-            <w:noProof/>
-            <w:webHidden/>
-          </w:rPr>
-          <w:fldChar w:fldCharType="separate"/>
-        </w:r>
-        <w:r>
-          <w:rPr>
-            <w:noProof/>
-            <w:webHidden/>
-          </w:rPr>
-          <w:t>6</w:t>
-        </w:r>
-        <w:r>
-          <w:rPr>
-            <w:noProof/>
-            <w:webHidden/>
-          </w:rPr>
-          <w:fldChar w:fldCharType="end"/>
-        </w:r>
-      </w:hyperlink>
-    </w:p>
-    <w:p>
-      <w:pPr>
-        <w:pStyle w:val="TOC3"/>
-        <w:rPr>
-          <w:rFonts w:eastAsiaTheme="minorEastAsia"/>
-          <w:noProof/>
-          <w:kern w:val="2"/>
-          <w:sz w:val="24"/>
-          <w:szCs w:val="24"/>
-          <w14:ligatures w14:val="standardContextual"/>
-        </w:rPr>
-      </w:pPr>
-      <w:hyperlink w:anchor="_Toc228189870" w:history="1">
-        <w:r>
-          <w:rPr>
-            <w:rStyle w:val="Hyperlink"/>
-            <w:noProof/>
-          </w:rPr>
-          <w:t>6.1 Schedule</w:t>
-        </w:r>
-        <w:r>
-          <w:rPr>
-            <w:noProof/>
-            <w:webHidden/>
-          </w:rPr>
-          <w:tab/>
-        </w:r>
-        <w:r>
-          <w:rPr>
-            <w:noProof/>
-            <w:webHidden/>
-          </w:rPr>
-          <w:fldChar w:fldCharType="begin"/>
-        </w:r>
-        <w:r>
-          <w:rPr>
-            <w:noProof/>
-            <w:webHidden/>
-          </w:rPr>
-          <w:instrText xml:space="preserve"> PAGEREF _Toc228189870 \h </w:instrText>
-        </w:r>
-        <w:r>
-          <w:rPr>
-            <w:noProof/>
-            <w:webHidden/>
-          </w:rPr>
-        </w:r>
-        <w:r>
-          <w:rPr>
-            <w:noProof/>
-            <w:webHidden/>
-          </w:rPr>
-          <w:fldChar w:fldCharType="separate"/>
-        </w:r>
-        <w:r>
-          <w:rPr>
-            <w:noProof/>
-            <w:webHidden/>
-          </w:rPr>
-          <w:t>6</w:t>
-        </w:r>
-        <w:r>
-          <w:rPr>
-            <w:noProof/>
-            <w:webHidden/>
-          </w:rPr>
-          <w:fldChar w:fldCharType="end"/>
-        </w:r>
-      </w:hyperlink>
-    </w:p>
-    <w:p>
-      <w:pPr>
-        <w:pStyle w:val="TOC3"/>
-        <w:rPr>
-          <w:rFonts w:eastAsiaTheme="minorEastAsia"/>
-          <w:noProof/>
-          <w:kern w:val="2"/>
-          <w:sz w:val="24"/>
-          <w:szCs w:val="24"/>
-          <w14:ligatures w14:val="standardContextual"/>
-        </w:rPr>
-      </w:pPr>
-      <w:hyperlink w:anchor="_Toc228189871" w:history="1">
-        <w:r>
-          <w:rPr>
-            <w:rStyle w:val="Hyperlink"/>
-            <w:noProof/>
-          </w:rPr>
-          <w:t>6.2 Script Logic</w:t>
-        </w:r>
-        <w:r>
-          <w:rPr>
-            <w:noProof/>
-            <w:webHidden/>
-          </w:rPr>
-          <w:tab/>
-        </w:r>
-        <w:r>
-          <w:rPr>
-            <w:noProof/>
-            <w:webHidden/>
-          </w:rPr>
-          <w:fldChar w:fldCharType="begin"/>
-        </w:r>
-        <w:r>
-          <w:rPr>
-            <w:noProof/>
-            <w:webHidden/>
-          </w:rPr>
-          <w:instrText xml:space="preserve"> PAGEREF _Toc228189871 \h </w:instrText>
-        </w:r>
-        <w:r>
-          <w:rPr>
-            <w:noProof/>
-            <w:webHidden/>
-          </w:rPr>
-        </w:r>
-        <w:r>
-          <w:rPr>
-            <w:noProof/>
-            <w:webHidden/>
-          </w:rPr>
-          <w:fldChar w:fldCharType="separate"/>
-        </w:r>
-        <w:r>
-          <w:rPr>
-            <w:noProof/>
-            <w:webHidden/>
-          </w:rPr>
-          <w:t>7</w:t>
-        </w:r>
-        <w:r>
-          <w:rPr>
-            <w:noProof/>
-            <w:webHidden/>
-          </w:rPr>
-          <w:fldChar w:fldCharType="end"/>
-        </w:r>
-      </w:hyperlink>
-    </w:p>
-    <w:p>
-      <w:pPr>
-        <w:pStyle w:val="TOC3"/>
-        <w:rPr>
-          <w:rFonts w:eastAsiaTheme="minorEastAsia"/>
-          <w:noProof/>
-          <w:kern w:val="2"/>
-          <w:sz w:val="24"/>
-          <w:szCs w:val="24"/>
-          <w14:ligatures w14:val="standardContextual"/>
-        </w:rPr>
-      </w:pPr>
-      <w:hyperlink w:anchor="_Toc228189872" w:history="1">
-        <w:r>
-          <w:rPr>
-            <w:rStyle w:val="Hyperlink"/>
-            <w:noProof/>
-          </w:rPr>
-          <w:t>6.3 Verifying a Successful Automated Run</w:t>
-        </w:r>
-        <w:r>
-          <w:rPr>
-            <w:noProof/>
-            <w:webHidden/>
-          </w:rPr>
-          <w:tab/>
-        </w:r>
-        <w:r>
-          <w:rPr>
-            <w:noProof/>
-            <w:webHidden/>
-          </w:rPr>
-          <w:fldChar w:fldCharType="begin"/>
-        </w:r>
-        <w:r>
-          <w:rPr>
-            <w:noProof/>
-            <w:webHidden/>
-          </w:rPr>
-          <w:instrText xml:space="preserve"> PAGEREF _Toc228189872 \h </w:instrText>
-        </w:r>
-        <w:r>
-          <w:rPr>
-            <w:noProof/>
-            <w:webHidden/>
-          </w:rPr>
-        </w:r>
-        <w:r>
-          <w:rPr>
-            <w:noProof/>
-            <w:webHidden/>
-          </w:rPr>
-          <w:fldChar w:fldCharType="separate"/>
-        </w:r>
-        <w:r>
-          <w:rPr>
-            <w:noProof/>
-            <w:webHidden/>
-          </w:rPr>
-          <w:t>7</w:t>
-        </w:r>
-        <w:r>
-          <w:rPr>
-            <w:noProof/>
-            <w:webHidden/>
-          </w:rPr>
-          <w:fldChar w:fldCharType="end"/>
-        </w:r>
-      </w:hyperlink>
-    </w:p>
-    <w:p>
-      <w:pPr>
-        <w:pStyle w:val="TOC2"/>
-        <w:rPr>
-          <w:rFonts w:asciiTheme="minorHAnsi" w:eastAsiaTheme="minorEastAsia" w:hAnsiTheme="minorHAnsi" w:cstheme="minorBidi"/>
-          <w:b w:val="0"/>
-          <w:i w:val="0"/>
-          <w:iCs w:val="0"/>
-          <w:noProof/>
-          <w:color w:val="auto"/>
-          <w:kern w:val="2"/>
-          <w:sz w:val="24"/>
-          <w:szCs w:val="24"/>
-          <w14:ligatures w14:val="standardContextual"/>
-        </w:rPr>
-      </w:pPr>
-      <w:hyperlink w:anchor="_Toc228189873" w:history="1">
-        <w:r>
-          <w:rPr>
-            <w:rStyle w:val="Hyperlink"/>
-            <w:noProof/>
-          </w:rPr>
-          <w:t>7. Manual / Interactive Execution (Notebook)</w:t>
-        </w:r>
-        <w:r>
-          <w:rPr>
-            <w:noProof/>
-            <w:webHidden/>
-          </w:rPr>
-          <w:tab/>
-        </w:r>
-        <w:r>
-          <w:rPr>
-            <w:noProof/>
-            <w:webHidden/>
-          </w:rPr>
-          <w:fldChar w:fldCharType="begin"/>
-        </w:r>
-        <w:r>
-          <w:rPr>
-            <w:noProof/>
-            <w:webHidden/>
-          </w:rPr>
-          <w:instrText xml:space="preserve"> PAGEREF _Toc228189873 \h </w:instrText>
-        </w:r>
-        <w:r>
-          <w:rPr>
-            <w:noProof/>
-            <w:webHidden/>
-          </w:rPr>
-        </w:r>
-        <w:r>
-          <w:rPr>
-            <w:noProof/>
-            <w:webHidden/>
-          </w:rPr>
-          <w:fldChar w:fldCharType="separate"/>
-        </w:r>
-        <w:r>
-          <w:rPr>
-            <w:noProof/>
-            <w:webHidden/>
-          </w:rPr>
-          <w:t>7</w:t>
-        </w:r>
-        <w:r>
-          <w:rPr>
-            <w:noProof/>
-            <w:webHidden/>
-          </w:rPr>
-          <w:fldChar w:fldCharType="end"/>
-        </w:r>
-      </w:hyperlink>
-    </w:p>
-    <w:p>
-      <w:pPr>
-        <w:pStyle w:val="TOC3"/>
-        <w:rPr>
-          <w:rFonts w:eastAsiaTheme="minorEastAsia"/>
-          <w:noProof/>
-          <w:kern w:val="2"/>
-          <w:sz w:val="24"/>
-          <w:szCs w:val="24"/>
-          <w14:ligatures w14:val="standardContextual"/>
-        </w:rPr>
-      </w:pPr>
-      <w:hyperlink w:anchor="_Toc228189874" w:history="1">
-        <w:r>
-          <w:rPr>
-            <w:rStyle w:val="Hyperlink"/>
-            <w:noProof/>
-          </w:rPr>
-          <w:t>7.1 Open the Notebook</w:t>
-        </w:r>
-        <w:r>
-          <w:rPr>
-            <w:noProof/>
-            <w:webHidden/>
-          </w:rPr>
-          <w:tab/>
-        </w:r>
-        <w:r>
-          <w:rPr>
-            <w:noProof/>
-            <w:webHidden/>
-          </w:rPr>
-          <w:fldChar w:fldCharType="begin"/>
-        </w:r>
-        <w:r>
-          <w:rPr>
-            <w:noProof/>
-            <w:webHidden/>
-          </w:rPr>
-          <w:instrText xml:space="preserve"> PAGEREF _Toc228189874 \h </w:instrText>
-        </w:r>
-        <w:r>
-          <w:rPr>
-            <w:noProof/>
-            <w:webHidden/>
-          </w:rPr>
-        </w:r>
-        <w:r>
-          <w:rPr>
-            <w:noProof/>
-            <w:webHidden/>
-          </w:rPr>
-          <w:fldChar w:fldCharType="separate"/>
-        </w:r>
-        <w:r>
-          <w:rPr>
-            <w:noProof/>
-            <w:webHidden/>
-          </w:rPr>
-          <w:t>7</w:t>
-        </w:r>
-        <w:r>
-          <w:rPr>
-            <w:noProof/>
-            <w:webHidden/>
-          </w:rPr>
-          <w:fldChar w:fldCharType="end"/>
-        </w:r>
-      </w:hyperlink>
-    </w:p>
-    <w:p>
-      <w:pPr>
-        <w:pStyle w:val="TOC3"/>
-        <w:rPr>
-          <w:rFonts w:eastAsiaTheme="minorEastAsia"/>
-          <w:noProof/>
-          <w:kern w:val="2"/>
-          <w:sz w:val="24"/>
-          <w:szCs w:val="24"/>
-          <w14:ligatures w14:val="standardContextual"/>
-        </w:rPr>
-      </w:pPr>
-      <w:hyperlink w:anchor="_Toc228189875" w:history="1">
-        <w:r>
-          <w:rPr>
-            <w:rStyle w:val="Hyperlink"/>
-            <w:noProof/>
-          </w:rPr>
-          <w:t>7.2 Verify Prerequisites</w:t>
-        </w:r>
-        <w:r>
-          <w:rPr>
-            <w:noProof/>
-            <w:webHidden/>
-          </w:rPr>
-          <w:tab/>
-        </w:r>
-        <w:r>
-          <w:rPr>
-            <w:noProof/>
-            <w:webHidden/>
-          </w:rPr>
-          <w:fldChar w:fldCharType="begin"/>
-        </w:r>
-        <w:r>
-          <w:rPr>
-            <w:noProof/>
-            <w:webHidden/>
-          </w:rPr>
-          <w:instrText xml:space="preserve"> PAGEREF _Toc228189875 \h </w:instrText>
-        </w:r>
-        <w:r>
-          <w:rPr>
-            <w:noProof/>
-            <w:webHidden/>
-          </w:rPr>
-        </w:r>
-        <w:r>
-          <w:rPr>
-            <w:noProof/>
-            <w:webHidden/>
-          </w:rPr>
-          <w:fldChar w:fldCharType="separate"/>
-        </w:r>
-        <w:r>
-          <w:rPr>
-            <w:noProof/>
-            <w:webHidden/>
-          </w:rPr>
-          <w:t>8</w:t>
-        </w:r>
-        <w:r>
-          <w:rPr>
-            <w:noProof/>
-            <w:webHidden/>
-          </w:rPr>
-          <w:fldChar w:fldCharType="end"/>
-        </w:r>
-      </w:hyperlink>
-    </w:p>
-    <w:p>
-      <w:pPr>
-        <w:pStyle w:val="TOC3"/>
-        <w:rPr>
-          <w:rFonts w:eastAsiaTheme="minorEastAsia"/>
-          <w:noProof/>
-          <w:kern w:val="2"/>
-          <w:sz w:val="24"/>
-          <w:szCs w:val="24"/>
-          <w14:ligatures w14:val="standardContextual"/>
-        </w:rPr>
-      </w:pPr>
-      <w:hyperlink w:anchor="_Toc228189876" w:history="1">
-        <w:r>
-          <w:rPr>
-            <w:rStyle w:val="Hyperlink"/>
-            <w:noProof/>
-          </w:rPr>
-          <w:t>7.3 Standard Run — Today's Report</w:t>
-        </w:r>
-        <w:r>
-          <w:rPr>
-            <w:noProof/>
-            <w:webHidden/>
-          </w:rPr>
-          <w:tab/>
-        </w:r>
-        <w:r>
-          <w:rPr>
-            <w:noProof/>
-            <w:webHidden/>
-          </w:rPr>
-          <w:fldChar w:fldCharType="begin"/>
-        </w:r>
-        <w:r>
-          <w:rPr>
-            <w:noProof/>
-            <w:webHidden/>
-          </w:rPr>
-          <w:instrText xml:space="preserve"> PAGEREF _Toc228189876 \h </w:instrText>
-        </w:r>
-        <w:r>
-          <w:rPr>
-            <w:noProof/>
-            <w:webHidden/>
-          </w:rPr>
-        </w:r>
-        <w:r>
-          <w:rPr>
-            <w:noProof/>
-            <w:webHidden/>
-          </w:rPr>
-          <w:fldChar w:fldCharType="separate"/>
-        </w:r>
-        <w:r>
-          <w:rPr>
-            <w:noProof/>
-            <w:webHidden/>
-          </w:rPr>
-          <w:t>8</w:t>
-        </w:r>
-        <w:r>
-          <w:rPr>
-            <w:noProof/>
-            <w:webHidden/>
-          </w:rPr>
-          <w:fldChar w:fldCharType="end"/>
-        </w:r>
-      </w:hyperlink>
-    </w:p>
-    <w:p>
-      <w:pPr>
-        <w:pStyle w:val="TOC3"/>
-        <w:rPr>
-          <w:rFonts w:eastAsiaTheme="minorEastAsia"/>
-          <w:noProof/>
-          <w:kern w:val="2"/>
-          <w:sz w:val="24"/>
-          <w:szCs w:val="24"/>
-          <w14:ligatures w14:val="standardContextual"/>
-        </w:rPr>
-      </w:pPr>
-      <w:hyperlink w:anchor="_Toc228189877" w:history="1">
-        <w:r>
-          <w:rPr>
-            <w:rStyle w:val="Hyperlink"/>
-            <w:noProof/>
-          </w:rPr>
-          <w:t>7.4 Backfill Run — All Historical Dates</w:t>
-        </w:r>
-        <w:r>
-          <w:rPr>
-            <w:noProof/>
-            <w:webHidden/>
-          </w:rPr>
-          <w:tab/>
-        </w:r>
-        <w:r>
-          <w:rPr>
-            <w:noProof/>
-            <w:webHidden/>
-          </w:rPr>
-          <w:fldChar w:fldCharType="begin"/>
-        </w:r>
-        <w:r>
-          <w:rPr>
-            <w:noProof/>
-            <w:webHidden/>
-          </w:rPr>
-          <w:instrText xml:space="preserve"> PAGEREF _Toc228189877 \h </w:instrText>
-        </w:r>
-        <w:r>
-          <w:rPr>
-            <w:noProof/>
-            <w:webHidden/>
-          </w:rPr>
-        </w:r>
-        <w:r>
-          <w:rPr>
-            <w:noProof/>
-            <w:webHidden/>
-          </w:rPr>
-          <w:fldChar w:fldCharType="separate"/>
-        </w:r>
-        <w:r>
-          <w:rPr>
-            <w:noProof/>
-            <w:webHidden/>
-          </w:rPr>
-          <w:t>8</w:t>
-        </w:r>
-        <w:r>
-          <w:rPr>
-            <w:noProof/>
-            <w:webHidden/>
-          </w:rPr>
-          <w:fldChar w:fldCharType="end"/>
-        </w:r>
-      </w:hyperlink>
-    </w:p>
-    <w:p>
-      <w:pPr>
-        <w:pStyle w:val="TOC2"/>
-        <w:rPr>
-          <w:rFonts w:asciiTheme="minorHAnsi" w:eastAsiaTheme="minorEastAsia" w:hAnsiTheme="minorHAnsi" w:cstheme="minorBidi"/>
-          <w:b w:val="0"/>
-          <w:i w:val="0"/>
-          <w:iCs w:val="0"/>
-          <w:noProof/>
-          <w:color w:val="auto"/>
-          <w:kern w:val="2"/>
-          <w:sz w:val="24"/>
-          <w:szCs w:val="24"/>
-          <w14:ligatures w14:val="standardContextual"/>
-        </w:rPr>
-      </w:pPr>
-      <w:hyperlink w:anchor="_Toc228189878" w:history="1">
-        <w:r>
-          <w:rPr>
-            <w:rStyle w:val="Hyperlink"/>
-            <w:noProof/>
-          </w:rPr>
-          <w:t>8. Output File</w:t>
-        </w:r>
-        <w:r>
-          <w:rPr>
-            <w:noProof/>
-            <w:webHidden/>
-          </w:rPr>
-          <w:tab/>
-        </w:r>
-        <w:r>
-          <w:rPr>
-            <w:noProof/>
-            <w:webHidden/>
-          </w:rPr>
-          <w:fldChar w:fldCharType="begin"/>
-        </w:r>
-        <w:r>
-          <w:rPr>
-            <w:noProof/>
-            <w:webHidden/>
-          </w:rPr>
-          <w:instrText xml:space="preserve"> PAGEREF _Toc228189878 \h </w:instrText>
-        </w:r>
-        <w:r>
-          <w:rPr>
-            <w:noProof/>
-            <w:webHidden/>
-          </w:rPr>
-        </w:r>
-        <w:r>
-          <w:rPr>
-            <w:noProof/>
-            <w:webHidden/>
-          </w:rPr>
-          <w:fldChar w:fldCharType="separate"/>
-        </w:r>
-        <w:r>
-          <w:rPr>
-            <w:noProof/>
-            <w:webHidden/>
-          </w:rPr>
-          <w:t>9</w:t>
-        </w:r>
-        <w:r>
-          <w:rPr>
-            <w:noProof/>
-            <w:webHidden/>
-          </w:rPr>
-          <w:fldChar w:fldCharType="end"/>
-        </w:r>
-      </w:hyperlink>
-    </w:p>
-    <w:p>
-      <w:pPr>
-        <w:pStyle w:val="TOC2"/>
-        <w:rPr>
-          <w:rFonts w:asciiTheme="minorHAnsi" w:eastAsiaTheme="minorEastAsia" w:hAnsiTheme="minorHAnsi" w:cstheme="minorBidi"/>
-          <w:b w:val="0"/>
-          <w:i w:val="0"/>
-          <w:iCs w:val="0"/>
-          <w:noProof/>
-          <w:color w:val="auto"/>
-          <w:kern w:val="2"/>
-          <w:sz w:val="24"/>
-          <w:szCs w:val="24"/>
-          <w14:ligatures w14:val="standardContextual"/>
-        </w:rPr>
-      </w:pPr>
-      <w:hyperlink w:anchor="_Toc228189879" w:history="1">
-        <w:r>
-          <w:rPr>
-            <w:rStyle w:val="Hyperlink"/>
-            <w:noProof/>
-          </w:rPr>
-          <w:t>9. Troubleshooting</w:t>
-        </w:r>
-        <w:r>
-          <w:rPr>
-            <w:noProof/>
-            <w:webHidden/>
-          </w:rPr>
-          <w:tab/>
-        </w:r>
-        <w:r>
-          <w:rPr>
-            <w:noProof/>
-            <w:webHidden/>
-          </w:rPr>
-          <w:fldChar w:fldCharType="begin"/>
-        </w:r>
-        <w:r>
-          <w:rPr>
-            <w:noProof/>
-            <w:webHidden/>
-          </w:rPr>
-          <w:instrText xml:space="preserve"> PAGEREF _Toc228189879 \h </w:instrText>
-        </w:r>
-        <w:r>
-          <w:rPr>
-            <w:noProof/>
-            <w:webHidden/>
-          </w:rPr>
-        </w:r>
-        <w:r>
-          <w:rPr>
-            <w:noProof/>
-            <w:webHidden/>
-          </w:rPr>
-          <w:fldChar w:fldCharType="separate"/>
-        </w:r>
-        <w:r>
-          <w:rPr>
-            <w:noProof/>
-            <w:webHidden/>
-          </w:rPr>
-          <w:t>9</w:t>
-        </w:r>
-        <w:r>
-          <w:rPr>
-            <w:noProof/>
-            <w:webHidden/>
-          </w:rPr>
-          <w:fldChar w:fldCharType="end"/>
-        </w:r>
-      </w:hyperlink>
-    </w:p>
-    <w:p>
-      <w:pPr>
-        <w:pStyle w:val="TOC2"/>
-        <w:rPr>
-          <w:rFonts w:asciiTheme="minorHAnsi" w:eastAsiaTheme="minorEastAsia" w:hAnsiTheme="minorHAnsi" w:cstheme="minorBidi"/>
-          <w:b w:val="0"/>
-          <w:i w:val="0"/>
-          <w:iCs w:val="0"/>
-          <w:noProof/>
-          <w:color w:val="auto"/>
-          <w:kern w:val="2"/>
-          <w:sz w:val="24"/>
-          <w:szCs w:val="24"/>
-          <w14:ligatures w14:val="standardContextual"/>
-        </w:rPr>
-      </w:pPr>
-      <w:hyperlink w:anchor="_Toc228189880" w:history="1">
-        <w:r>
-          <w:rPr>
-            <w:rStyle w:val="Hyperlink"/>
-            <w:noProof/>
-          </w:rPr>
-          <w:t>10. Relationship to Other Processes</w:t>
-        </w:r>
-        <w:r>
-          <w:rPr>
-            <w:noProof/>
-            <w:webHidden/>
-          </w:rPr>
-          <w:tab/>
-        </w:r>
-        <w:r>
-          <w:rPr>
-            <w:noProof/>
-            <w:webHidden/>
-          </w:rPr>
-          <w:fldChar w:fldCharType="begin"/>
-        </w:r>
-        <w:r>
-          <w:rPr>
-            <w:noProof/>
-            <w:webHidden/>
-          </w:rPr>
-          <w:instrText xml:space="preserve"> PAGEREF _Toc228189880 \h </w:instrText>
-        </w:r>
-        <w:r>
-          <w:rPr>
-            <w:noProof/>
-            <w:webHidden/>
-          </w:rPr>
-        </w:r>
-        <w:r>
-          <w:rPr>
-            <w:noProof/>
-            <w:webHidden/>
-          </w:rPr>
-          <w:fldChar w:fldCharType="separate"/>
-        </w:r>
-        <w:r>
-          <w:rPr>
-            <w:noProof/>
-            <w:webHidden/>
-          </w:rPr>
-          <w:t>10</w:t>
-        </w:r>
-        <w:r>
-          <w:rPr>
-            <w:noProof/>
-            <w:webHidden/>
-          </w:rPr>
-          <w:fldChar w:fldCharType="end"/>
-        </w:r>
-      </w:hyperlink>
-    </w:p>
-    <w:p>
-      <w:pPr>
-        <w:pStyle w:val="TOC2"/>
-        <w:rPr>
-          <w:rFonts w:asciiTheme="minorHAnsi" w:eastAsiaTheme="minorEastAsia" w:hAnsiTheme="minorHAnsi" w:cstheme="minorBidi"/>
-          <w:b w:val="0"/>
-          <w:i w:val="0"/>
-          <w:iCs w:val="0"/>
-          <w:noProof/>
-          <w:color w:val="auto"/>
-          <w:kern w:val="2"/>
-          <w:sz w:val="24"/>
-          <w:szCs w:val="24"/>
-          <w14:ligatures w14:val="standardContextual"/>
-        </w:rPr>
-      </w:pPr>
-      <w:hyperlink w:anchor="_Toc228189881" w:history="1">
-        <w:r>
-          <w:rPr>
-            <w:rStyle w:val="Hyperlink"/>
-            <w:noProof/>
-          </w:rPr>
-          <w:t>11. Appendix - Standalone Python Script</w:t>
-        </w:r>
-        <w:r>
-          <w:rPr>
-            <w:noProof/>
-            <w:webHidden/>
-          </w:rPr>
-          <w:tab/>
-        </w:r>
-        <w:r>
-          <w:rPr>
-            <w:noProof/>
-            <w:webHidden/>
-          </w:rPr>
-          <w:fldChar w:fldCharType="begin"/>
-        </w:r>
-        <w:r>
-          <w:rPr>
-            <w:noProof/>
-            <w:webHidden/>
-          </w:rPr>
-          <w:instrText xml:space="preserve"> PAGEREF _Toc228189881 \h </w:instrText>
-        </w:r>
-        <w:r>
-          <w:rPr>
-            <w:noProof/>
-            <w:webHidden/>
-          </w:rPr>
-        </w:r>
-        <w:r>
-          <w:rPr>
-            <w:noProof/>
-            <w:webHidden/>
-          </w:rPr>
-          <w:fldChar w:fldCharType="separate"/>
-        </w:r>
-        <w:r>
-          <w:rPr>
-            <w:noProof/>
-            <w:webHidden/>
-          </w:rPr>
-          <w:t>11</w:t>
-        </w:r>
-        <w:r>
-          <w:rPr>
-            <w:noProof/>
-            <w:webHidden/>
-          </w:rPr>
-          <w:fldChar w:fldCharType="end"/>
-        </w:r>
-      </w:hyperlink>
-    </w:p>
-    <w:p>
-      <w:pPr>
-        <w:pStyle w:val="TOC2"/>
-        <w:rPr>
-          <w:rFonts w:asciiTheme="minorHAnsi" w:eastAsiaTheme="minorEastAsia" w:hAnsiTheme="minorHAnsi" w:cstheme="minorBidi"/>
-          <w:b w:val="0"/>
-          <w:i w:val="0"/>
-          <w:iCs w:val="0"/>
-          <w:noProof/>
-          <w:color w:val="auto"/>
-          <w:kern w:val="2"/>
-          <w:sz w:val="24"/>
-          <w:szCs w:val="24"/>
-          <w14:ligatures w14:val="standardContextual"/>
-        </w:rPr>
-      </w:pPr>
-      <w:hyperlink w:anchor="_Toc228189882" w:history="1">
-        <w:r>
-          <w:rPr>
-            <w:rStyle w:val="Hyperlink"/>
-            <w:noProof/>
-          </w:rPr>
-          <w:t>12. Related Documents</w:t>
-        </w:r>
-        <w:r>
-          <w:rPr>
-            <w:noProof/>
-            <w:webHidden/>
-          </w:rPr>
-          <w:tab/>
-        </w:r>
-        <w:r>
-          <w:rPr>
-            <w:noProof/>
-            <w:webHidden/>
-          </w:rPr>
-          <w:fldChar w:fldCharType="begin"/>
-        </w:r>
-        <w:r>
-          <w:rPr>
-            <w:noProof/>
-            <w:webHidden/>
-          </w:rPr>
-          <w:instrText xml:space="preserve"> PAGEREF _Toc228189882 \h </w:instrText>
-        </w:r>
-        <w:r>
-          <w:rPr>
-            <w:noProof/>
-            <w:webHidden/>
-          </w:rPr>
-        </w:r>
-        <w:r>
-          <w:rPr>
-            <w:noProof/>
-            <w:webHidden/>
-          </w:rPr>
-          <w:fldChar w:fldCharType="separate"/>
-        </w:r>
-        <w:r>
-          <w:rPr>
-            <w:noProof/>
-            <w:webHidden/>
-          </w:rPr>
-          <w:t>12</w:t>
-        </w:r>
-        <w:r>
-          <w:rPr>
-            <w:noProof/>
-            <w:webHidden/>
-          </w:rPr>
-          <w:fldChar w:fldCharType="end"/>
-        </w:r>
-      </w:hyperlink>
-    </w:p>
-    <w:p>
+      <w:r>
+        <w:t>Right-click and update field.</w:t>
+      </w:r>
       <w:r>
         <w:fldChar w:fldCharType="end"/>
       </w:r>
@@ -2446,11 +1130,9 @@
       <w:pPr>
         <w:pStyle w:val="Heading2"/>
       </w:pPr>
-      <w:bookmarkStart w:id="1" w:name="_Toc228189859"/>
       <w:r>
         <w:t>1. Purpose</w:t>
       </w:r>
-      <w:bookmarkEnd w:id="1"/>
     </w:p>
     <w:p/>
     <w:p>
@@ -2492,12 +1174,12 @@
     <w:tbl>
       <w:tblPr>
         <w:tblStyle w:val="TableGrid"/>
-        <w:tblW w:w="0" w:type="auto"/>
-        <w:tblLook w:val="04A0" w:firstRow="1" w:lastRow="0" w:firstColumn="1" w:lastColumn="0" w:noHBand="0" w:noVBand="1"/>
+        <w:tblW w:type="auto" w:w="0"/>
+        <w:tblLook w:firstColumn="1" w:firstRow="1" w:lastColumn="0" w:lastRow="0" w:noHBand="0" w:noVBand="1" w:val="04A0"/>
       </w:tblPr>
       <w:tblGrid>
-        <w:gridCol w:w="4676"/>
-        <w:gridCol w:w="4674"/>
+        <w:gridCol w:w="4680"/>
+        <w:gridCol w:w="4680"/>
       </w:tblGrid>
       <w:tr>
         <w:trPr>
@@ -2506,7 +1188,7 @@
         </w:trPr>
         <w:tc>
           <w:tcPr>
-            <w:tcW w:w="4680" w:type="dxa"/>
+            <w:tcW w:type="dxa" w:w="4680"/>
           </w:tcPr>
           <w:p>
             <w:r>
@@ -2516,7 +1198,7 @@
         </w:tc>
         <w:tc>
           <w:tcPr>
-            <w:tcW w:w="4680" w:type="dxa"/>
+            <w:tcW w:type="dxa" w:w="4680"/>
           </w:tcPr>
           <w:p>
             <w:r>
@@ -2531,7 +1213,7 @@
         </w:trPr>
         <w:tc>
           <w:tcPr>
-            <w:tcW w:w="4680" w:type="dxa"/>
+            <w:tcW w:type="dxa" w:w="4680"/>
           </w:tcPr>
           <w:p>
             <w:r>
@@ -2541,14 +1223,11 @@
         </w:tc>
         <w:tc>
           <w:tcPr>
-            <w:tcW w:w="4680" w:type="dxa"/>
+            <w:tcW w:type="dxa" w:w="4680"/>
           </w:tcPr>
           <w:p>
             <w:r>
-              <w:t xml:space="preserve">Normal daily </w:t>
-            </w:r>
-            <w:r>
-              <w:t>operations — runs automatically on a schedule</w:t>
+              <w:t>Normal daily operations — runs automatically on a schedule</w:t>
             </w:r>
           </w:p>
         </w:tc>
@@ -2559,7 +1238,7 @@
         </w:trPr>
         <w:tc>
           <w:tcPr>
-            <w:tcW w:w="4680" w:type="dxa"/>
+            <w:tcW w:type="dxa" w:w="4680"/>
           </w:tcPr>
           <w:p>
             <w:r>
@@ -2569,7 +1248,7 @@
         </w:tc>
         <w:tc>
           <w:tcPr>
-            <w:tcW w:w="4680" w:type="dxa"/>
+            <w:tcW w:type="dxa" w:w="4680"/>
           </w:tcPr>
           <w:p>
             <w:r>
@@ -2590,11 +1269,9 @@
       <w:pPr>
         <w:pStyle w:val="Heading2"/>
       </w:pPr>
-      <w:bookmarkStart w:id="2" w:name="_Toc228189860"/>
       <w:r>
         <w:t>2. Scope</w:t>
       </w:r>
-      <w:bookmarkEnd w:id="2"/>
     </w:p>
     <w:p/>
     <w:p>
@@ -2613,23 +1290,18 @@
       <w:pPr>
         <w:pStyle w:val="Heading2"/>
       </w:pPr>
-      <w:bookmarkStart w:id="3" w:name="_Toc228189861"/>
-      <w:r>
-        <w:lastRenderedPageBreak/>
+      <w:r>
         <w:t>3. Prerequisites</w:t>
       </w:r>
-      <w:bookmarkEnd w:id="3"/>
     </w:p>
     <w:p/>
     <w:p>
       <w:pPr>
         <w:pStyle w:val="Heading3"/>
       </w:pPr>
-      <w:bookmarkStart w:id="4" w:name="_Toc228189862"/>
       <w:r>
         <w:t>3.1 Environment</w:t>
       </w:r>
-      <w:bookmarkEnd w:id="4"/>
     </w:p>
     <w:p>
       <w:pPr>
@@ -2639,12 +1311,12 @@
     <w:tbl>
       <w:tblPr>
         <w:tblStyle w:val="TableGrid"/>
-        <w:tblW w:w="0" w:type="auto"/>
-        <w:tblLook w:val="04A0" w:firstRow="1" w:lastRow="0" w:firstColumn="1" w:lastColumn="0" w:noHBand="0" w:noVBand="1"/>
+        <w:tblW w:type="auto" w:w="0"/>
+        <w:tblLook w:firstColumn="1" w:firstRow="1" w:lastColumn="0" w:lastRow="0" w:noHBand="0" w:noVBand="1" w:val="04A0"/>
       </w:tblPr>
       <w:tblGrid>
-        <w:gridCol w:w="4676"/>
-        <w:gridCol w:w="4674"/>
+        <w:gridCol w:w="4680"/>
+        <w:gridCol w:w="4680"/>
       </w:tblGrid>
       <w:tr>
         <w:trPr>
@@ -2653,7 +1325,7 @@
         </w:trPr>
         <w:tc>
           <w:tcPr>
-            <w:tcW w:w="4680" w:type="dxa"/>
+            <w:tcW w:type="dxa" w:w="4680"/>
           </w:tcPr>
           <w:p>
             <w:r>
@@ -2663,7 +1335,7 @@
         </w:tc>
         <w:tc>
           <w:tcPr>
-            <w:tcW w:w="4680" w:type="dxa"/>
+            <w:tcW w:type="dxa" w:w="4680"/>
           </w:tcPr>
           <w:p>
             <w:r>
@@ -2678,7 +1350,7 @@
         </w:trPr>
         <w:tc>
           <w:tcPr>
-            <w:tcW w:w="4680" w:type="dxa"/>
+            <w:tcW w:type="dxa" w:w="4680"/>
           </w:tcPr>
           <w:p>
             <w:r>
@@ -2688,14 +1360,11 @@
         </w:tc>
         <w:tc>
           <w:tcPr>
-            <w:tcW w:w="4680" w:type="dxa"/>
+            <w:tcW w:type="dxa" w:w="4680"/>
           </w:tcPr>
           <w:p>
             <w:r>
-              <w:t xml:space="preserve">Must be available in the environment where </w:t>
-            </w:r>
-            <w:r>
-              <w:t>`main.py` executes</w:t>
+              <w:t>Must be available in the environment where `main.py` executes</w:t>
             </w:r>
           </w:p>
         </w:tc>
@@ -2706,7 +1375,7 @@
         </w:trPr>
         <w:tc>
           <w:tcPr>
-            <w:tcW w:w="4680" w:type="dxa"/>
+            <w:tcW w:type="dxa" w:w="4680"/>
           </w:tcPr>
           <w:p>
             <w:r>
@@ -2716,7 +1385,7 @@
         </w:tc>
         <w:tc>
           <w:tcPr>
-            <w:tcW w:w="4680" w:type="dxa"/>
+            <w:tcW w:type="dxa" w:w="4680"/>
           </w:tcPr>
           <w:p>
             <w:r>
@@ -2731,7 +1400,7 @@
         </w:trPr>
         <w:tc>
           <w:tcPr>
-            <w:tcW w:w="4680" w:type="dxa"/>
+            <w:tcW w:type="dxa" w:w="4680"/>
           </w:tcPr>
           <w:p>
             <w:r>
@@ -2741,7 +1410,7 @@
         </w:tc>
         <w:tc>
           <w:tcPr>
-            <w:tcW w:w="4680" w:type="dxa"/>
+            <w:tcW w:type="dxa" w:w="4680"/>
           </w:tcPr>
           <w:p>
             <w:r>
@@ -2756,7 +1425,7 @@
         </w:trPr>
         <w:tc>
           <w:tcPr>
-            <w:tcW w:w="4680" w:type="dxa"/>
+            <w:tcW w:type="dxa" w:w="4680"/>
           </w:tcPr>
           <w:p>
             <w:r>
@@ -2766,7 +1435,7 @@
         </w:tc>
         <w:tc>
           <w:tcPr>
-            <w:tcW w:w="4680" w:type="dxa"/>
+            <w:tcW w:type="dxa" w:w="4680"/>
           </w:tcPr>
           <w:p>
             <w:r>
@@ -2799,11 +1468,9 @@
       <w:pPr>
         <w:pStyle w:val="Heading3"/>
       </w:pPr>
-      <w:bookmarkStart w:id="5" w:name="_Toc228189863"/>
       <w:r>
         <w:t>3.2 Input Data</w:t>
       </w:r>
-      <w:bookmarkEnd w:id="5"/>
     </w:p>
     <w:p/>
     <w:p>
@@ -2879,11 +1546,9 @@
       <w:pPr>
         <w:pStyle w:val="Heading2"/>
       </w:pPr>
-      <w:bookmarkStart w:id="6" w:name="_Toc228189864"/>
       <w:r>
         <w:t>4. Key Configuration</w:t>
       </w:r>
-      <w:bookmarkEnd w:id="6"/>
     </w:p>
     <w:p/>
     <w:p>
@@ -2909,12 +1574,12 @@
     <w:tbl>
       <w:tblPr>
         <w:tblStyle w:val="TableGrid"/>
-        <w:tblW w:w="0" w:type="auto"/>
-        <w:tblLook w:val="04A0" w:firstRow="1" w:lastRow="0" w:firstColumn="1" w:lastColumn="0" w:noHBand="0" w:noVBand="1"/>
+        <w:tblW w:type="auto" w:w="0"/>
+        <w:tblLook w:firstColumn="1" w:firstRow="1" w:lastColumn="0" w:lastRow="0" w:noHBand="0" w:noVBand="1" w:val="04A0"/>
       </w:tblPr>
       <w:tblGrid>
-        <w:gridCol w:w="3668"/>
-        <w:gridCol w:w="5682"/>
+        <w:gridCol w:w="4680"/>
+        <w:gridCol w:w="4680"/>
       </w:tblGrid>
       <w:tr>
         <w:trPr>
@@ -2923,7 +1588,7 @@
         </w:trPr>
         <w:tc>
           <w:tcPr>
-            <w:tcW w:w="4680" w:type="dxa"/>
+            <w:tcW w:type="dxa" w:w="4680"/>
           </w:tcPr>
           <w:p>
             <w:r>
@@ -2933,7 +1598,7 @@
         </w:tc>
         <w:tc>
           <w:tcPr>
-            <w:tcW w:w="4680" w:type="dxa"/>
+            <w:tcW w:type="dxa" w:w="4680"/>
           </w:tcPr>
           <w:p>
             <w:r>
@@ -2948,7 +1613,7 @@
         </w:trPr>
         <w:tc>
           <w:tcPr>
-            <w:tcW w:w="4680" w:type="dxa"/>
+            <w:tcW w:type="dxa" w:w="4680"/>
           </w:tcPr>
           <w:p>
             <w:r>
@@ -2958,7 +1623,7 @@
         </w:tc>
         <w:tc>
           <w:tcPr>
-            <w:tcW w:w="4680" w:type="dxa"/>
+            <w:tcW w:type="dxa" w:w="4680"/>
           </w:tcPr>
           <w:p>
             <w:r>
@@ -2973,7 +1638,7 @@
         </w:trPr>
         <w:tc>
           <w:tcPr>
-            <w:tcW w:w="4680" w:type="dxa"/>
+            <w:tcW w:type="dxa" w:w="4680"/>
           </w:tcPr>
           <w:p>
             <w:r>
@@ -2983,7 +1648,7 @@
         </w:tc>
         <w:tc>
           <w:tcPr>
-            <w:tcW w:w="4680" w:type="dxa"/>
+            <w:tcW w:type="dxa" w:w="4680"/>
           </w:tcPr>
           <w:p>
             <w:r>
@@ -2998,7 +1663,7 @@
         </w:trPr>
         <w:tc>
           <w:tcPr>
-            <w:tcW w:w="4680" w:type="dxa"/>
+            <w:tcW w:type="dxa" w:w="4680"/>
           </w:tcPr>
           <w:p>
             <w:r>
@@ -3008,7 +1673,7 @@
         </w:tc>
         <w:tc>
           <w:tcPr>
-            <w:tcW w:w="4680" w:type="dxa"/>
+            <w:tcW w:type="dxa" w:w="4680"/>
           </w:tcPr>
           <w:p>
             <w:r>
@@ -3045,22 +1710,18 @@
       <w:pPr>
         <w:pStyle w:val="Heading2"/>
       </w:pPr>
-      <w:bookmarkStart w:id="7" w:name="_Toc228189865"/>
       <w:r>
         <w:t>5. How the Process Works</w:t>
       </w:r>
-      <w:bookmarkEnd w:id="7"/>
     </w:p>
     <w:p/>
     <w:p>
       <w:pPr>
         <w:pStyle w:val="Heading3"/>
       </w:pPr>
-      <w:bookmarkStart w:id="8" w:name="_Toc228189866"/>
       <w:r>
         <w:t>5.1 File Discovery</w:t>
       </w:r>
-      <w:bookmarkEnd w:id="8"/>
     </w:p>
     <w:p/>
     <w:p>
@@ -3090,6 +1751,7 @@
     </w:p>
     <w:p/>
     <w:p>
+      <w:pPr/>
       <w:r>
         <w:t xml:space="preserve">Skips any path containing a folder name in </w:t>
       </w:r>
@@ -3105,6 +1767,7 @@
       </w:r>
     </w:p>
     <w:p>
+      <w:pPr/>
       <w:r>
         <w:t xml:space="preserve">Treats the </w:t>
       </w:r>
@@ -3129,6 +1792,7 @@
       </w:r>
     </w:p>
     <w:p>
+      <w:pPr/>
       <w:r>
         <w:t xml:space="preserve">Matches files whose names end with </w:t>
       </w:r>
@@ -3157,11 +1821,9 @@
       <w:pPr>
         <w:pStyle w:val="Heading3"/>
       </w:pPr>
-      <w:bookmarkStart w:id="9" w:name="_Toc228189867"/>
       <w:r>
         <w:t>5.2 Consolidation</w:t>
       </w:r>
-      <w:bookmarkEnd w:id="9"/>
     </w:p>
     <w:p/>
     <w:p>
@@ -3170,13 +1832,14 @@
       </w:r>
     </w:p>
     <w:p>
+      <w:pPr/>
       <w:r>
         <w:t>The CSV is read into a DataFrame.</w:t>
       </w:r>
     </w:p>
     <w:p>
-      <w:r>
-        <w:lastRenderedPageBreak/>
+      <w:pPr/>
+      <w:r>
         <w:t xml:space="preserve">Two columns are added: </w:t>
       </w:r>
       <w:r>
@@ -3201,6 +1864,7 @@
       </w:r>
     </w:p>
     <w:p>
+      <w:pPr/>
       <w:r>
         <w:t xml:space="preserve">All per-partner DataFrames are concatenated into a single </w:t>
       </w:r>
@@ -3236,11 +1900,9 @@
       <w:pPr>
         <w:pStyle w:val="Heading3"/>
       </w:pPr>
-      <w:bookmarkStart w:id="10" w:name="_Toc228189868"/>
       <w:r>
         <w:t>5.3 Output</w:t>
       </w:r>
-      <w:bookmarkEnd w:id="10"/>
     </w:p>
     <w:p/>
     <w:p>
@@ -3257,137 +1919,135 @@
           <w:rFonts w:ascii="Consolas" w:hAnsi="Consolas"/>
           <w:sz w:val="18"/>
         </w:rPr>
-        <w:t xml:space="preserve">Z:\HTOC\Data_Analytics\Data\OpDiv_Predictions\Full Daily </w:t>
+        <w:t>Z:\HTOC\Data_Analytics\Data\OpDiv_Predictions\Full Daily Reports\full_daily_report_{YYYYMMDD}.csv</w:t>
+      </w:r>
+    </w:p>
+    <w:p/>
+    <w:p>
+      <w:r>
+        <w:t xml:space="preserve">The output file is </w:t>
+      </w:r>
+      <w:r>
+        <w:rPr>
+          <w:b/>
+        </w:rPr>
+        <w:t>never overwritten</w:t>
+      </w:r>
+      <w:r>
+        <w:t xml:space="preserve"> — if it already exists for today's date, the process prints </w:t>
       </w:r>
       <w:r>
         <w:rPr>
           <w:rFonts w:ascii="Consolas" w:hAnsi="Consolas"/>
           <w:sz w:val="18"/>
         </w:rPr>
-        <w:t>Reports\full_daily_report_{YYYYMMDD}.csv</w:t>
+        <w:t>"File already exists: …"</w:t>
+      </w:r>
+      <w:r>
+        <w:t xml:space="preserve"> and skips the write. This prevents duplicate runs from corrupting the report.</w:t>
       </w:r>
     </w:p>
     <w:p/>
     <w:p>
       <w:r>
-        <w:t xml:space="preserve">The output file is </w:t>
-      </w:r>
-      <w:r>
-        <w:rPr>
-          <w:b/>
-        </w:rPr>
-        <w:t>never overwritten</w:t>
-      </w:r>
-      <w:r>
-        <w:t xml:space="preserve"> — if it already exists for today's date, the process prints </w:t>
-      </w:r>
+        <w:t>-</w:t>
+      </w:r>
+    </w:p>
+    <w:p/>
+    <w:p>
+      <w:pPr>
+        <w:pStyle w:val="Heading2"/>
+      </w:pPr>
+      <w:r>
+        <w:t>6. Automated Execution (main.py)</w:t>
+      </w:r>
+    </w:p>
+    <w:p/>
+    <w:p>
+      <w:pPr>
+        <w:pStyle w:val="Heading3"/>
+      </w:pPr>
+      <w:r>
+        <w:t>6.1 Schedule</w:t>
+      </w:r>
+    </w:p>
+    <w:p/>
+    <w:p>
       <w:r>
         <w:rPr>
           <w:rFonts w:ascii="Consolas" w:hAnsi="Consolas"/>
           <w:sz w:val="18"/>
         </w:rPr>
-        <w:t>"File already exists: …"</w:t>
-      </w:r>
-      <w:r>
-        <w:t xml:space="preserve"> and skips the write. This prevents duplicate runs from corrupting the report.</w:t>
+        <w:t>main.py</w:t>
+      </w:r>
+      <w:r>
+        <w:t xml:space="preserve"> runs automatically every day at </w:t>
+      </w:r>
+      <w:r>
+        <w:rPr>
+          <w:b/>
+        </w:rPr>
+        <w:t>8:15 AM</w:t>
+      </w:r>
+      <w:r>
+        <w:t xml:space="preserve"> via </w:t>
+      </w:r>
+      <w:r>
+        <w:rPr>
+          <w:b/>
+        </w:rPr>
+        <w:t>Windows Task Scheduler</w:t>
+      </w:r>
+      <w:r>
+        <w:t xml:space="preserve"> on </w:t>
+      </w:r>
+      <w:r>
+        <w:rPr>
+          <w:b/>
+        </w:rPr>
+        <w:t>F.R.E.D</w:t>
+      </w:r>
+      <w:r>
+        <w:t xml:space="preserve">. It executes the </w:t>
+      </w:r>
+      <w:r>
+        <w:rPr>
+          <w:b/>
+        </w:rPr>
+        <w:t>today-only</w:t>
+      </w:r>
+      <w:r>
+        <w:t xml:space="preserve"> consolidation flow: load today's partner CSVs → merge → save single consolidated report.</w:t>
       </w:r>
     </w:p>
     <w:p/>
     <w:p>
       <w:r>
-        <w:t>-</w:t>
+        <w:t>Manual execution (Section 7) is only necessary when troubleshooting a failed scheduled run, backfilling historical dates, or testing changes to the notebook before deployment.</w:t>
       </w:r>
     </w:p>
     <w:p/>
     <w:p>
       <w:pPr>
-        <w:pStyle w:val="Heading2"/>
-      </w:pPr>
-      <w:bookmarkStart w:id="11" w:name="_Toc228189869"/>
-      <w:r>
-        <w:t>6. Automated Execution (main.py)</w:t>
-      </w:r>
-      <w:bookmarkEnd w:id="11"/>
+        <w:pStyle w:val="Heading3"/>
+      </w:pPr>
+      <w:r>
+        <w:t>6.2 Script Logic</w:t>
+      </w:r>
     </w:p>
     <w:p/>
     <w:p>
       <w:pPr>
-        <w:pStyle w:val="Heading3"/>
-      </w:pPr>
-      <w:bookmarkStart w:id="12" w:name="_Toc228189870"/>
-      <w:r>
-        <w:t>6.1 Schedule</w:t>
-      </w:r>
-      <w:bookmarkEnd w:id="12"/>
-    </w:p>
-    <w:p/>
-    <w:p>
+        <w:pStyle w:val="NoSpacing"/>
+      </w:pPr>
       <w:r>
         <w:rPr>
           <w:rFonts w:ascii="Consolas" w:hAnsi="Consolas"/>
           <w:sz w:val="18"/>
         </w:rPr>
-        <w:t>main.py</w:t>
-      </w:r>
-      <w:r>
-        <w:t xml:space="preserve"> runs automatically every day at </w:t>
-      </w:r>
-      <w:r>
-        <w:rPr>
-          <w:b/>
-        </w:rPr>
-        <w:t>8:15 AM</w:t>
-      </w:r>
-      <w:r>
-        <w:t xml:space="preserve"> via </w:t>
-      </w:r>
-      <w:r>
-        <w:rPr>
-          <w:b/>
-        </w:rPr>
-        <w:t>Windows Task Scheduler</w:t>
-      </w:r>
-      <w:r>
-        <w:t xml:space="preserve"> on </w:t>
-      </w:r>
-      <w:r>
-        <w:rPr>
-          <w:b/>
-        </w:rPr>
-        <w:t>F.R.E.D</w:t>
-      </w:r>
-      <w:r>
-        <w:t xml:space="preserve">. It executes the </w:t>
-      </w:r>
-      <w:r>
-        <w:rPr>
-          <w:b/>
-        </w:rPr>
-        <w:t>today-only</w:t>
-      </w:r>
-      <w:r>
-        <w:t xml:space="preserve"> consolidation flow: load today's partner CSVs → merge → save single consolidated report.</w:t>
-      </w:r>
-    </w:p>
-    <w:p/>
-    <w:p>
-      <w:r>
-        <w:t>Manual execution (Section 7) is only necessary when troubleshooting a failed scheduled run, backfilling historical dates, or testing changes to the notebook before deployment.</w:t>
-      </w:r>
-    </w:p>
-    <w:p/>
-    <w:p>
-      <w:pPr>
-        <w:pStyle w:val="Heading3"/>
-      </w:pPr>
-      <w:bookmarkStart w:id="13" w:name="_Toc228189871"/>
-      <w:r>
-        <w:lastRenderedPageBreak/>
-        <w:t>6.2 Script Logic</w:t>
-      </w:r>
-      <w:bookmarkEnd w:id="13"/>
-    </w:p>
-    <w:p/>
+        <w:t>main()</w:t>
+      </w:r>
+    </w:p>
     <w:p>
       <w:pPr>
         <w:pStyle w:val="NoSpacing"/>
@@ -3397,7 +2057,7 @@
           <w:rFonts w:ascii="Consolas" w:hAnsi="Consolas"/>
           <w:sz w:val="18"/>
         </w:rPr>
-        <w:t>main()</w:t>
+        <w:t xml:space="preserve">  ├── Compute today_str (YYYYMMDD)</w:t>
       </w:r>
     </w:p>
     <w:p>
@@ -3409,7 +2069,7 @@
           <w:rFonts w:ascii="Consolas" w:hAnsi="Consolas"/>
           <w:sz w:val="18"/>
         </w:rPr>
-        <w:t xml:space="preserve">  ├── Compute today_str (YYYYMMDD)</w:t>
+        <w:t xml:space="preserve">  ├── load_all_csvs_from_folders(DATA_PATH, today_only=True)</w:t>
       </w:r>
     </w:p>
     <w:p>
@@ -3421,7 +2081,7 @@
           <w:rFonts w:ascii="Consolas" w:hAnsi="Consolas"/>
           <w:sz w:val="18"/>
         </w:rPr>
-        <w:t xml:space="preserve">  ├── load_all_csvs_from_folders(DATA_PATH, today_only=True)</w:t>
+        <w:t xml:space="preserve">  │     ├── Walk DATA_PATH, skip EXCLUDE_FOLDERS</w:t>
       </w:r>
     </w:p>
     <w:p>
@@ -3433,7 +2093,7 @@
           <w:rFonts w:ascii="Consolas" w:hAnsi="Consolas"/>
           <w:sz w:val="18"/>
         </w:rPr>
-        <w:t xml:space="preserve">  │     ├── Walk DATA_PATH, skip EXCLUDE_FOLDERS</w:t>
+        <w:t xml:space="preserve">  │     ├── Match files: {today_str}.csv only</w:t>
       </w:r>
     </w:p>
     <w:p>
@@ -3445,7 +2105,7 @@
           <w:rFonts w:ascii="Consolas" w:hAnsi="Consolas"/>
           <w:sz w:val="18"/>
         </w:rPr>
-        <w:t xml:space="preserve">  │     ├── Match files: {today_str}.csv only</w:t>
+        <w:t xml:space="preserve">  │     ├── Add Partner and FileDate columns</w:t>
       </w:r>
     </w:p>
     <w:p>
@@ -3457,7 +2117,7 @@
           <w:rFonts w:ascii="Consolas" w:hAnsi="Consolas"/>
           <w:sz w:val="18"/>
         </w:rPr>
-        <w:t xml:space="preserve">  │     ├── Add Partner and FileDate columns</w:t>
+        <w:t xml:space="preserve">  │     └── Return concatenated DataFrame (or empty if none found)</w:t>
       </w:r>
     </w:p>
     <w:p>
@@ -3469,7 +2129,7 @@
           <w:rFonts w:ascii="Consolas" w:hAnsi="Consolas"/>
           <w:sz w:val="18"/>
         </w:rPr>
-        <w:t xml:space="preserve">  │     └── Return concatenated DataFrame (or empty if none found)</w:t>
+        <w:t xml:space="preserve">  └── If DataFrame is non-empty:</w:t>
       </w:r>
     </w:p>
     <w:p>
@@ -3481,7 +2141,7 @@
           <w:rFonts w:ascii="Consolas" w:hAnsi="Consolas"/>
           <w:sz w:val="18"/>
         </w:rPr>
-        <w:t xml:space="preserve">  └── If DataFrame is non-empty:</w:t>
+        <w:t xml:space="preserve">        └── save_daily_report(df, SAVE_PATH, today_str)</w:t>
       </w:r>
     </w:p>
     <w:p>
@@ -3493,7 +2153,7 @@
           <w:rFonts w:ascii="Consolas" w:hAnsi="Consolas"/>
           <w:sz w:val="18"/>
         </w:rPr>
-        <w:t xml:space="preserve">        └── save_daily_report(df, SAVE_PATH, today_str)</w:t>
+        <w:t xml:space="preserve">              ├── Build output path: full_daily_report_{today_str}.csv</w:t>
       </w:r>
     </w:p>
     <w:p>
@@ -3505,7 +2165,7 @@
           <w:rFonts w:ascii="Consolas" w:hAnsi="Consolas"/>
           <w:sz w:val="18"/>
         </w:rPr>
-        <w:t xml:space="preserve">              ├── Build output path: full_daily_report_{today_str}.csv</w:t>
+        <w:t xml:space="preserve">              ├── If file exists → print and skip</w:t>
       </w:r>
     </w:p>
     <w:p>
@@ -3517,134 +2177,119 @@
           <w:rFonts w:ascii="Consolas" w:hAnsi="Consolas"/>
           <w:sz w:val="18"/>
         </w:rPr>
-        <w:t xml:space="preserve">              ├── If file exists → print and skip</w:t>
-      </w:r>
-    </w:p>
-    <w:p>
-      <w:pPr>
-        <w:pStyle w:val="NoSpacing"/>
-      </w:pPr>
+        <w:t xml:space="preserve">              └── Else → makedirs + to_csv + print path</w:t>
+      </w:r>
+    </w:p>
+    <w:p/>
+    <w:p>
+      <w:pPr>
+        <w:pStyle w:val="Heading3"/>
+      </w:pPr>
+      <w:r>
+        <w:t>6.3 Verifying a Successful Automated Run</w:t>
+      </w:r>
+    </w:p>
+    <w:p/>
+    <w:p>
+      <w:r>
+        <w:t>Confirm the run succeeded by checking that:</w:t>
+      </w:r>
+    </w:p>
+    <w:p>
+      <w:pPr/>
+      <w:r>
+        <w:t xml:space="preserve">The file </w:t>
+      </w:r>
       <w:r>
         <w:rPr>
           <w:rFonts w:ascii="Consolas" w:hAnsi="Consolas"/>
           <w:sz w:val="18"/>
         </w:rPr>
-        <w:t xml:space="preserve">              └── Else → makedirs + to_csv + print path</w:t>
-      </w:r>
-    </w:p>
-    <w:p/>
-    <w:p>
-      <w:pPr>
-        <w:pStyle w:val="Heading3"/>
-      </w:pPr>
-      <w:bookmarkStart w:id="14" w:name="_Toc228189872"/>
-      <w:r>
-        <w:t>6.3 Verifying a Successful Automated Run</w:t>
-      </w:r>
-      <w:bookmarkEnd w:id="14"/>
-    </w:p>
-    <w:p/>
-    <w:p>
-      <w:r>
-        <w:t>Confirm the run succeeded by checking that:</w:t>
-      </w:r>
-    </w:p>
-    <w:p>
-      <w:r>
-        <w:t xml:space="preserve">The file </w:t>
+        <w:t>full_daily_report_{YYYYMMDD}.csv</w:t>
+      </w:r>
+      <w:r>
+        <w:t xml:space="preserve"> exists in </w:t>
       </w:r>
       <w:r>
         <w:rPr>
           <w:rFonts w:ascii="Consolas" w:hAnsi="Consolas"/>
           <w:sz w:val="18"/>
         </w:rPr>
-        <w:t>full_daily_report_{YYYYMMDD}.csv</w:t>
-      </w:r>
-      <w:r>
-        <w:t xml:space="preserve"> exists in </w:t>
+        <w:t>Full Daily Reports</w:t>
+      </w:r>
+      <w:r>
+        <w:t xml:space="preserve"> for today's date.</w:t>
+      </w:r>
+    </w:p>
+    <w:p>
+      <w:pPr/>
+      <w:r>
+        <w:t xml:space="preserve">The file is non-empty and contains the expected </w:t>
       </w:r>
       <w:r>
         <w:rPr>
           <w:rFonts w:ascii="Consolas" w:hAnsi="Consolas"/>
           <w:sz w:val="18"/>
         </w:rPr>
-        <w:t>Full Daily Reports</w:t>
-      </w:r>
-      <w:r>
-        <w:t xml:space="preserve"> for today's date.</w:t>
-      </w:r>
-    </w:p>
-    <w:p>
-      <w:r>
-        <w:t xml:space="preserve">The file is non-empty and contains the expected </w:t>
+        <w:t>Partner</w:t>
+      </w:r>
+      <w:r>
+        <w:t xml:space="preserve"> and </w:t>
       </w:r>
       <w:r>
         <w:rPr>
           <w:rFonts w:ascii="Consolas" w:hAnsi="Consolas"/>
           <w:sz w:val="18"/>
         </w:rPr>
-        <w:t>Partner</w:t>
-      </w:r>
-      <w:r>
-        <w:t xml:space="preserve"> and </w:t>
+        <w:t>FileDate</w:t>
+      </w:r>
+      <w:r>
+        <w:t xml:space="preserve"> columns.</w:t>
+      </w:r>
+    </w:p>
+    <w:p/>
+    <w:p>
+      <w:r>
+        <w:t>-</w:t>
+      </w:r>
+    </w:p>
+    <w:p/>
+    <w:p>
+      <w:pPr>
+        <w:pStyle w:val="Heading2"/>
+      </w:pPr>
+      <w:r>
+        <w:t>7. Manual / Interactive Execution (Notebook)</w:t>
+      </w:r>
+    </w:p>
+    <w:p/>
+    <w:p>
+      <w:r>
+        <w:t xml:space="preserve">Use </w:t>
       </w:r>
       <w:r>
         <w:rPr>
           <w:rFonts w:ascii="Consolas" w:hAnsi="Consolas"/>
           <w:sz w:val="18"/>
         </w:rPr>
-        <w:t>FileDate</w:t>
-      </w:r>
-      <w:r>
-        <w:t xml:space="preserve"> columns.</w:t>
+        <w:t>daily_reports.ipynb</w:t>
+      </w:r>
+      <w:r>
+        <w:t xml:space="preserve"> when you need to run the consolidation manually, troubleshoot a failed automated run, or backfill reports for historical dates.</w:t>
       </w:r>
     </w:p>
     <w:p/>
     <w:p>
-      <w:r>
-        <w:t>-</w:t>
+      <w:pPr>
+        <w:pStyle w:val="Heading3"/>
+      </w:pPr>
+      <w:r>
+        <w:t>7.1 Open the Notebook</w:t>
       </w:r>
     </w:p>
     <w:p/>
     <w:p>
-      <w:pPr>
-        <w:pStyle w:val="Heading2"/>
-      </w:pPr>
-      <w:bookmarkStart w:id="15" w:name="_Toc228189873"/>
-      <w:r>
-        <w:t>7. Manual / Interactive Execution (Notebook)</w:t>
-      </w:r>
-      <w:bookmarkEnd w:id="15"/>
-    </w:p>
-    <w:p/>
-    <w:p>
-      <w:r>
-        <w:t xml:space="preserve">Use </w:t>
-      </w:r>
-      <w:r>
-        <w:rPr>
-          <w:rFonts w:ascii="Consolas" w:hAnsi="Consolas"/>
-          <w:sz w:val="18"/>
-        </w:rPr>
-        <w:t>daily_reports.ipynb</w:t>
-      </w:r>
-      <w:r>
-        <w:t xml:space="preserve"> when you need to run the consolidation manually, troubleshoot a failed automated run, or backfill reports for historical dates.</w:t>
-      </w:r>
-    </w:p>
-    <w:p/>
-    <w:p>
-      <w:pPr>
-        <w:pStyle w:val="Heading3"/>
-      </w:pPr>
-      <w:bookmarkStart w:id="16" w:name="_Toc228189874"/>
-      <w:r>
-        <w:t>7.1 Open the Notebook</w:t>
-      </w:r>
-      <w:bookmarkEnd w:id="16"/>
-    </w:p>
-    <w:p/>
-    <w:p>
+      <w:pPr/>
       <w:r>
         <w:t xml:space="preserve">Open </w:t>
       </w:r>
@@ -3659,6 +2304,7 @@
       </w:r>
     </w:p>
     <w:p>
+      <w:pPr/>
       <w:r>
         <w:t xml:space="preserve">Navigate to </w:t>
       </w:r>
@@ -3677,6 +2323,7 @@
       </w:r>
     </w:p>
     <w:p>
+      <w:pPr/>
       <w:r>
         <w:t xml:space="preserve">Open </w:t>
       </w:r>
@@ -3696,15 +2343,13 @@
       <w:pPr>
         <w:pStyle w:val="Heading3"/>
       </w:pPr>
-      <w:bookmarkStart w:id="17" w:name="_Toc228189875"/>
-      <w:r>
-        <w:lastRenderedPageBreak/>
+      <w:r>
         <w:t>7.2 Verify Prerequisites</w:t>
       </w:r>
-      <w:bookmarkEnd w:id="17"/>
     </w:p>
     <w:p/>
     <w:p>
+      <w:pPr/>
       <w:r>
         <w:t xml:space="preserve">[ ] </w:t>
       </w:r>
@@ -3723,6 +2368,7 @@
       </w:r>
     </w:p>
     <w:p>
+      <w:pPr/>
       <w:r>
         <w:t xml:space="preserve">[ ] Partner prediction CSVs for the target date exist under </w:t>
       </w:r>
@@ -3745,11 +2391,9 @@
       <w:pPr>
         <w:pStyle w:val="Heading3"/>
       </w:pPr>
-      <w:bookmarkStart w:id="18" w:name="_Toc228189876"/>
       <w:r>
         <w:t>7.3 Standard Run — Today's Report</w:t>
       </w:r>
-      <w:bookmarkEnd w:id="18"/>
     </w:p>
     <w:p/>
     <w:p>
@@ -3777,6 +2421,7 @@
     </w:p>
     <w:p/>
     <w:p>
+      <w:pPr/>
       <w:r>
         <w:rPr>
           <w:b/>
@@ -3798,6 +2443,7 @@
       </w:r>
     </w:p>
     <w:p>
+      <w:pPr/>
       <w:r>
         <w:rPr>
           <w:b/>
@@ -3855,11 +2501,9 @@
       <w:pPr>
         <w:pStyle w:val="Heading3"/>
       </w:pPr>
-      <w:bookmarkStart w:id="19" w:name="_Toc228189877"/>
       <w:r>
         <w:t>7.4 Backfill Run — All Historical Dates</w:t>
       </w:r>
-      <w:bookmarkEnd w:id="19"/>
     </w:p>
     <w:p/>
     <w:p>
@@ -3917,6 +2561,7 @@
     </w:p>
     <w:p/>
     <w:p>
+      <w:pPr/>
       <w:r>
         <w:rPr>
           <w:b/>
@@ -3957,6 +2602,7 @@
       </w:r>
     </w:p>
     <w:p>
+      <w:pPr/>
       <w:r>
         <w:rPr>
           <w:b/>
@@ -4016,7 +2662,6 @@
     <w:p/>
     <w:p>
       <w:r>
-        <w:lastRenderedPageBreak/>
         <w:t>-</w:t>
       </w:r>
     </w:p>
@@ -4025,11 +2670,9 @@
       <w:pPr>
         <w:pStyle w:val="Heading2"/>
       </w:pPr>
-      <w:bookmarkStart w:id="20" w:name="_Toc228189878"/>
       <w:r>
         <w:t>8. Output File</w:t>
       </w:r>
-      <w:bookmarkEnd w:id="20"/>
     </w:p>
     <w:p>
       <w:pPr>
@@ -4039,12 +2682,12 @@
     <w:tbl>
       <w:tblPr>
         <w:tblStyle w:val="TableGrid"/>
-        <w:tblW w:w="0" w:type="auto"/>
-        <w:tblLook w:val="04A0" w:firstRow="1" w:lastRow="0" w:firstColumn="1" w:lastColumn="0" w:noHBand="0" w:noVBand="1"/>
+        <w:tblW w:type="auto" w:w="0"/>
+        <w:tblLook w:firstColumn="1" w:firstRow="1" w:lastColumn="0" w:lastRow="0" w:noHBand="0" w:noVBand="1" w:val="04A0"/>
       </w:tblPr>
       <w:tblGrid>
-        <w:gridCol w:w="3668"/>
-        <w:gridCol w:w="5682"/>
+        <w:gridCol w:w="4680"/>
+        <w:gridCol w:w="4680"/>
       </w:tblGrid>
       <w:tr>
         <w:trPr>
@@ -4053,7 +2696,7 @@
         </w:trPr>
         <w:tc>
           <w:tcPr>
-            <w:tcW w:w="4680" w:type="dxa"/>
+            <w:tcW w:type="dxa" w:w="4680"/>
           </w:tcPr>
           <w:p>
             <w:r>
@@ -4063,7 +2706,7 @@
         </w:tc>
         <w:tc>
           <w:tcPr>
-            <w:tcW w:w="4680" w:type="dxa"/>
+            <w:tcW w:type="dxa" w:w="4680"/>
           </w:tcPr>
           <w:p>
             <w:r>
@@ -4078,7 +2721,7 @@
         </w:trPr>
         <w:tc>
           <w:tcPr>
-            <w:tcW w:w="4680" w:type="dxa"/>
+            <w:tcW w:type="dxa" w:w="4680"/>
           </w:tcPr>
           <w:p>
             <w:r>
@@ -4088,7 +2731,7 @@
         </w:tc>
         <w:tc>
           <w:tcPr>
-            <w:tcW w:w="4680" w:type="dxa"/>
+            <w:tcW w:type="dxa" w:w="4680"/>
           </w:tcPr>
           <w:p>
             <w:r>
@@ -4103,7 +2746,7 @@
         </w:trPr>
         <w:tc>
           <w:tcPr>
-            <w:tcW w:w="4680" w:type="dxa"/>
+            <w:tcW w:type="dxa" w:w="4680"/>
           </w:tcPr>
           <w:p>
             <w:r>
@@ -4113,7 +2756,7 @@
         </w:tc>
         <w:tc>
           <w:tcPr>
-            <w:tcW w:w="4680" w:type="dxa"/>
+            <w:tcW w:type="dxa" w:w="4680"/>
           </w:tcPr>
           <w:p>
             <w:r>
@@ -4128,7 +2771,7 @@
         </w:trPr>
         <w:tc>
           <w:tcPr>
-            <w:tcW w:w="4680" w:type="dxa"/>
+            <w:tcW w:type="dxa" w:w="4680"/>
           </w:tcPr>
           <w:p>
             <w:r>
@@ -4138,7 +2781,7 @@
         </w:tc>
         <w:tc>
           <w:tcPr>
-            <w:tcW w:w="4680" w:type="dxa"/>
+            <w:tcW w:type="dxa" w:w="4680"/>
           </w:tcPr>
           <w:p>
             <w:r>
@@ -4153,7 +2796,7 @@
         </w:trPr>
         <w:tc>
           <w:tcPr>
-            <w:tcW w:w="4680" w:type="dxa"/>
+            <w:tcW w:type="dxa" w:w="4680"/>
           </w:tcPr>
           <w:p>
             <w:r>
@@ -4163,14 +2806,11 @@
         </w:tc>
         <w:tc>
           <w:tcPr>
-            <w:tcW w:w="4680" w:type="dxa"/>
+            <w:tcW w:type="dxa" w:w="4680"/>
           </w:tcPr>
           <w:p>
             <w:r>
-              <w:t xml:space="preserve">`Partner` (source folder name), `FileDate` (from </w:t>
-            </w:r>
-            <w:r>
-              <w:t>filename)</w:t>
+              <w:t>`Partner` (source folder name), `FileDate` (from filename)</w:t>
             </w:r>
           </w:p>
         </w:tc>
@@ -4213,11 +2853,9 @@
       <w:pPr>
         <w:pStyle w:val="Heading2"/>
       </w:pPr>
-      <w:bookmarkStart w:id="21" w:name="_Toc228189879"/>
       <w:r>
         <w:t>9. Troubleshooting</w:t>
       </w:r>
-      <w:bookmarkEnd w:id="21"/>
     </w:p>
     <w:p>
       <w:pPr>
@@ -4227,13 +2865,13 @@
     <w:tbl>
       <w:tblPr>
         <w:tblStyle w:val="TableGrid"/>
-        <w:tblW w:w="0" w:type="auto"/>
-        <w:tblLook w:val="04A0" w:firstRow="1" w:lastRow="0" w:firstColumn="1" w:lastColumn="0" w:noHBand="0" w:noVBand="1"/>
+        <w:tblW w:type="auto" w:w="0"/>
+        <w:tblLook w:firstColumn="1" w:firstRow="1" w:lastColumn="0" w:lastRow="0" w:noHBand="0" w:noVBand="1" w:val="04A0"/>
       </w:tblPr>
       <w:tblGrid>
-        <w:gridCol w:w="1849"/>
-        <w:gridCol w:w="2126"/>
-        <w:gridCol w:w="5375"/>
+        <w:gridCol w:w="3120"/>
+        <w:gridCol w:w="3120"/>
+        <w:gridCol w:w="3120"/>
       </w:tblGrid>
       <w:tr>
         <w:trPr>
@@ -4242,7 +2880,7 @@
         </w:trPr>
         <w:tc>
           <w:tcPr>
-            <w:tcW w:w="3120" w:type="dxa"/>
+            <w:tcW w:type="dxa" w:w="3120"/>
           </w:tcPr>
           <w:p>
             <w:r>
@@ -4252,7 +2890,7 @@
         </w:tc>
         <w:tc>
           <w:tcPr>
-            <w:tcW w:w="3120" w:type="dxa"/>
+            <w:tcW w:type="dxa" w:w="3120"/>
           </w:tcPr>
           <w:p>
             <w:r>
@@ -4262,7 +2900,7 @@
         </w:tc>
         <w:tc>
           <w:tcPr>
-            <w:tcW w:w="3120" w:type="dxa"/>
+            <w:tcW w:type="dxa" w:w="3120"/>
           </w:tcPr>
           <w:p>
             <w:r>
@@ -4277,7 +2915,7 @@
         </w:trPr>
         <w:tc>
           <w:tcPr>
-            <w:tcW w:w="3120" w:type="dxa"/>
+            <w:tcW w:type="dxa" w:w="3120"/>
           </w:tcPr>
           <w:p>
             <w:r>
@@ -4287,7 +2925,7 @@
         </w:tc>
         <w:tc>
           <w:tcPr>
-            <w:tcW w:w="3120" w:type="dxa"/>
+            <w:tcW w:type="dxa" w:w="3120"/>
           </w:tcPr>
           <w:p>
             <w:r>
@@ -4297,7 +2935,7 @@
         </w:tc>
         <w:tc>
           <w:tcPr>
-            <w:tcW w:w="3120" w:type="dxa"/>
+            <w:tcW w:type="dxa" w:w="3120"/>
           </w:tcPr>
           <w:p>
             <w:r>
@@ -4312,7 +2950,7 @@
         </w:trPr>
         <w:tc>
           <w:tcPr>
-            <w:tcW w:w="3120" w:type="dxa"/>
+            <w:tcW w:type="dxa" w:w="3120"/>
           </w:tcPr>
           <w:p>
             <w:r>
@@ -4322,7 +2960,7 @@
         </w:tc>
         <w:tc>
           <w:tcPr>
-            <w:tcW w:w="3120" w:type="dxa"/>
+            <w:tcW w:type="dxa" w:w="3120"/>
           </w:tcPr>
           <w:p>
             <w:r>
@@ -4332,7 +2970,7 @@
         </w:tc>
         <w:tc>
           <w:tcPr>
-            <w:tcW w:w="3120" w:type="dxa"/>
+            <w:tcW w:type="dxa" w:w="3120"/>
           </w:tcPr>
           <w:p>
             <w:r>
@@ -4347,18 +2985,17 @@
         </w:trPr>
         <w:tc>
           <w:tcPr>
-            <w:tcW w:w="3120" w:type="dxa"/>
+            <w:tcW w:type="dxa" w:w="3120"/>
           </w:tcPr>
           <w:p>
             <w:r>
-              <w:lastRenderedPageBreak/>
               <w:t>`"No data to save."`</w:t>
             </w:r>
           </w:p>
         </w:tc>
         <w:tc>
           <w:tcPr>
-            <w:tcW w:w="3120" w:type="dxa"/>
+            <w:tcW w:type="dxa" w:w="3120"/>
           </w:tcPr>
           <w:p>
             <w:r>
@@ -4368,7 +3005,7 @@
         </w:tc>
         <w:tc>
           <w:tcPr>
-            <w:tcW w:w="3120" w:type="dxa"/>
+            <w:tcW w:type="dxa" w:w="3120"/>
           </w:tcPr>
           <w:p>
             <w:r>
@@ -4383,7 +3020,7 @@
         </w:trPr>
         <w:tc>
           <w:tcPr>
-            <w:tcW w:w="3120" w:type="dxa"/>
+            <w:tcW w:type="dxa" w:w="3120"/>
           </w:tcPr>
           <w:p>
             <w:r>
@@ -4393,7 +3030,7 @@
         </w:tc>
         <w:tc>
           <w:tcPr>
-            <w:tcW w:w="3120" w:type="dxa"/>
+            <w:tcW w:type="dxa" w:w="3120"/>
           </w:tcPr>
           <w:p>
             <w:r>
@@ -4403,7 +3040,7 @@
         </w:tc>
         <w:tc>
           <w:tcPr>
-            <w:tcW w:w="3120" w:type="dxa"/>
+            <w:tcW w:type="dxa" w:w="3120"/>
           </w:tcPr>
           <w:p>
             <w:r>
@@ -4418,7 +3055,7 @@
         </w:trPr>
         <w:tc>
           <w:tcPr>
-            <w:tcW w:w="3120" w:type="dxa"/>
+            <w:tcW w:type="dxa" w:w="3120"/>
           </w:tcPr>
           <w:p>
             <w:r>
@@ -4428,7 +3065,7 @@
         </w:tc>
         <w:tc>
           <w:tcPr>
-            <w:tcW w:w="3120" w:type="dxa"/>
+            <w:tcW w:type="dxa" w:w="3120"/>
           </w:tcPr>
           <w:p>
             <w:r>
@@ -4438,14 +3075,11 @@
         </w:tc>
         <w:tc>
           <w:tcPr>
-            <w:tcW w:w="3120" w:type="dxa"/>
+            <w:tcW w:type="dxa" w:w="3120"/>
           </w:tcPr>
           <w:p>
             <w:r>
-              <w:t xml:space="preserve">Inspect the file at the printed path; re-run </w:t>
-            </w:r>
-            <w:r>
-              <w:t>after fixing or removing the corrupt file</w:t>
+              <w:t>Inspect the file at the printed path; re-run after fixing or removing the corrupt file</w:t>
             </w:r>
           </w:p>
         </w:tc>
@@ -4456,7 +3090,7 @@
         </w:trPr>
         <w:tc>
           <w:tcPr>
-            <w:tcW w:w="3120" w:type="dxa"/>
+            <w:tcW w:type="dxa" w:w="3120"/>
           </w:tcPr>
           <w:p>
             <w:r>
@@ -4466,7 +3100,7 @@
         </w:tc>
         <w:tc>
           <w:tcPr>
-            <w:tcW w:w="3120" w:type="dxa"/>
+            <w:tcW w:type="dxa" w:w="3120"/>
           </w:tcPr>
           <w:p>
             <w:r>
@@ -4476,7 +3110,7 @@
         </w:tc>
         <w:tc>
           <w:tcPr>
-            <w:tcW w:w="3120" w:type="dxa"/>
+            <w:tcW w:type="dxa" w:w="3120"/>
           </w:tcPr>
           <w:p>
             <w:r>
@@ -4491,7 +3125,7 @@
         </w:trPr>
         <w:tc>
           <w:tcPr>
-            <w:tcW w:w="3120" w:type="dxa"/>
+            <w:tcW w:type="dxa" w:w="3120"/>
           </w:tcPr>
           <w:p>
             <w:r>
@@ -4501,7 +3135,7 @@
         </w:tc>
         <w:tc>
           <w:tcPr>
-            <w:tcW w:w="3120" w:type="dxa"/>
+            <w:tcW w:type="dxa" w:w="3120"/>
           </w:tcPr>
           <w:p>
             <w:r>
@@ -4511,7 +3145,7 @@
         </w:tc>
         <w:tc>
           <w:tcPr>
-            <w:tcW w:w="3120" w:type="dxa"/>
+            <w:tcW w:type="dxa" w:w="3120"/>
           </w:tcPr>
           <w:p>
             <w:r>
@@ -4532,11 +3166,9 @@
       <w:pPr>
         <w:pStyle w:val="Heading2"/>
       </w:pPr>
-      <w:bookmarkStart w:id="22" w:name="_Toc228189880"/>
       <w:r>
         <w:t>10. Relationship to Other Processes</w:t>
       </w:r>
-      <w:bookmarkEnd w:id="22"/>
     </w:p>
     <w:p/>
     <w:p>
@@ -4570,13 +3202,13 @@
     <w:tbl>
       <w:tblPr>
         <w:tblStyle w:val="TableGrid"/>
-        <w:tblW w:w="0" w:type="auto"/>
-        <w:tblLook w:val="04A0" w:firstRow="1" w:lastRow="0" w:firstColumn="1" w:lastColumn="0" w:noHBand="0" w:noVBand="1"/>
+        <w:tblW w:type="auto" w:w="0"/>
+        <w:tblLook w:firstColumn="1" w:firstRow="1" w:lastColumn="0" w:lastRow="0" w:noHBand="0" w:noVBand="1" w:val="04A0"/>
       </w:tblPr>
       <w:tblGrid>
-        <w:gridCol w:w="506"/>
-        <w:gridCol w:w="2645"/>
-        <w:gridCol w:w="6199"/>
+        <w:gridCol w:w="3120"/>
+        <w:gridCol w:w="3120"/>
+        <w:gridCol w:w="3120"/>
       </w:tblGrid>
       <w:tr>
         <w:trPr>
@@ -4585,7 +3217,7 @@
         </w:trPr>
         <w:tc>
           <w:tcPr>
-            <w:tcW w:w="3120" w:type="dxa"/>
+            <w:tcW w:type="dxa" w:w="3120"/>
           </w:tcPr>
           <w:p>
             <w:r>
@@ -4595,7 +3227,7 @@
         </w:tc>
         <w:tc>
           <w:tcPr>
-            <w:tcW w:w="3120" w:type="dxa"/>
+            <w:tcW w:type="dxa" w:w="3120"/>
           </w:tcPr>
           <w:p>
             <w:r>
@@ -4605,7 +3237,7 @@
         </w:tc>
         <w:tc>
           <w:tcPr>
-            <w:tcW w:w="3120" w:type="dxa"/>
+            <w:tcW w:type="dxa" w:w="3120"/>
           </w:tcPr>
           <w:p>
             <w:r>
@@ -4620,7 +3252,7 @@
         </w:trPr>
         <w:tc>
           <w:tcPr>
-            <w:tcW w:w="3120" w:type="dxa"/>
+            <w:tcW w:type="dxa" w:w="3120"/>
           </w:tcPr>
           <w:p>
             <w:r>
@@ -4630,20 +3262,17 @@
         </w:tc>
         <w:tc>
           <w:tcPr>
-            <w:tcW w:w="3120" w:type="dxa"/>
+            <w:tcW w:type="dxa" w:w="3120"/>
           </w:tcPr>
           <w:p>
             <w:r>
-              <w:t xml:space="preserve">NOI forecasting </w:t>
-            </w:r>
-            <w:r>
-              <w:t>pipeline (`NextObservedIndicatorV3.0.ipynb` or batch equivalent) runs first</w:t>
+              <w:t>NOI forecasting pipeline (`NextObservedIndicatorV3.0.ipynb` or batch equivalent) runs first</w:t>
             </w:r>
           </w:p>
         </w:tc>
         <w:tc>
           <w:tcPr>
-            <w:tcW w:w="3120" w:type="dxa"/>
+            <w:tcW w:type="dxa" w:w="3120"/>
           </w:tcPr>
           <w:p>
             <w:r>
@@ -4658,18 +3287,17 @@
         </w:trPr>
         <w:tc>
           <w:tcPr>
-            <w:tcW w:w="3120" w:type="dxa"/>
+            <w:tcW w:type="dxa" w:w="3120"/>
           </w:tcPr>
           <w:p>
             <w:r>
-              <w:lastRenderedPageBreak/>
               <w:t>2</w:t>
             </w:r>
           </w:p>
         </w:tc>
         <w:tc>
           <w:tcPr>
-            <w:tcW w:w="3120" w:type="dxa"/>
+            <w:tcW w:type="dxa" w:w="3120"/>
           </w:tcPr>
           <w:p>
             <w:r>
@@ -4679,7 +3307,7 @@
         </w:tc>
         <w:tc>
           <w:tcPr>
-            <w:tcW w:w="3120" w:type="dxa"/>
+            <w:tcW w:type="dxa" w:w="3120"/>
           </w:tcPr>
           <w:p>
             <w:r>
@@ -4694,7 +3322,7 @@
         </w:trPr>
         <w:tc>
           <w:tcPr>
-            <w:tcW w:w="3120" w:type="dxa"/>
+            <w:tcW w:type="dxa" w:w="3120"/>
           </w:tcPr>
           <w:p>
             <w:r>
@@ -4704,7 +3332,7 @@
         </w:tc>
         <w:tc>
           <w:tcPr>
-            <w:tcW w:w="3120" w:type="dxa"/>
+            <w:tcW w:type="dxa" w:w="3120"/>
           </w:tcPr>
           <w:p>
             <w:r>
@@ -4714,14 +3342,11 @@
         </w:tc>
         <w:tc>
           <w:tcPr>
-            <w:tcW w:w="3120" w:type="dxa"/>
+            <w:tcW w:type="dxa" w:w="3120"/>
           </w:tcPr>
           <w:p>
             <w:r>
-              <w:t xml:space="preserve">Partner distribution products and </w:t>
-            </w:r>
-            <w:r>
-              <w:t>operational reports</w:t>
+              <w:t>Partner distribution products and operational reports</w:t>
             </w:r>
           </w:p>
         </w:tc>
@@ -4744,19 +3369,14 @@
       <w:pPr>
         <w:pStyle w:val="Heading2"/>
       </w:pPr>
-      <w:bookmarkStart w:id="23" w:name="_Toc228189881"/>
       <w:r>
         <w:t>11. Appendix - Standalone Python Script</w:t>
       </w:r>
-      <w:bookmarkEnd w:id="23"/>
     </w:p>
     <w:p/>
     <w:p>
       <w:r>
-        <w:t xml:space="preserve">The complete standalone script extracted from the notebook is </w:t>
-      </w:r>
-      <w:r>
-        <w:t>attached at:</w:t>
+        <w:t>The complete standalone script extracted from the notebook is attached at:</w:t>
       </w:r>
     </w:p>
     <w:p/>
@@ -4802,15 +3422,13 @@
       <w:pPr>
         <w:pStyle w:val="Heading2"/>
       </w:pPr>
-      <w:bookmarkStart w:id="24" w:name="_Toc228189882"/>
-      <w:r>
-        <w:lastRenderedPageBreak/>
+      <w:r>
         <w:t>12. Related Documents</w:t>
       </w:r>
-      <w:bookmarkEnd w:id="24"/>
     </w:p>
     <w:p/>
     <w:p>
+      <w:pPr/>
       <w:r>
         <w:rPr>
           <w:rFonts w:ascii="Consolas" w:hAnsi="Consolas"/>
@@ -4823,6 +3441,7 @@
       </w:r>
     </w:p>
     <w:p>
+      <w:pPr/>
       <w:r>
         <w:rPr>
           <w:rFonts w:ascii="Consolas" w:hAnsi="Consolas"/>
@@ -4838,6 +3457,7 @@
       </w:r>
     </w:p>
     <w:p>
+      <w:pPr/>
       <w:r>
         <w:rPr>
           <w:rFonts w:ascii="Consolas" w:hAnsi="Consolas"/>
@@ -4853,6 +3473,7 @@
       </w:r>
     </w:p>
     <w:p>
+      <w:pPr/>
       <w:r>
         <w:rPr>
           <w:rFonts w:ascii="Consolas" w:hAnsi="Consolas"/>
@@ -5016,7 +3637,7 @@
               <w:noProof/>
             </w:rPr>
             <w:drawing>
-              <wp:inline distT="0" distB="0" distL="0" distR="0" wp14:anchorId="081CF32B" wp14:editId="59A95B03">
+              <wp:inline distT="0" distB="0" distL="0" distR="0" wp14:anchorId="72DEBE38" wp14:editId="66345231">
                 <wp:extent cx="957532" cy="444240"/>
                 <wp:effectExtent l="0" t="0" r="0" b="0"/>
                 <wp:docPr id="1601952155" name="Picture 1601952155"/>
@@ -5137,6 +3758,7 @@
         <w:szCs w:val="18"/>
       </w:rPr>
     </w:pPr>
+    <w:proofErr w:type="gramStart"/>
     <w:r>
       <w:rPr>
         <w:rFonts w:ascii="Poppins ExtraBold" w:hAnsi="Poppins ExtraBold" w:cs="Poppins ExtraBold"/>
@@ -5144,6 +3766,7 @@
       </w:rPr>
       <w:t>TLP:AMBER</w:t>
     </w:r>
+    <w:proofErr w:type="gramEnd"/>
   </w:p>
 </w:ftr>
 </file>
@@ -5314,12 +3937,8 @@
         <w:p>
           <w:r>
             <w:t>TLP:AMBER</w:t>
-          </w:r>
-          <w:r>
             <w:br/>
             <w:t>Daily Partner Prediction Report Consolidation — daily_reports</w:t>
-          </w:r>
-          <w:r>
             <w:br/>
             <w:t>April 2026</w:t>
           </w:r>
@@ -5345,7 +3964,7 @@
               <w:noProof/>
             </w:rPr>
             <w:drawing>
-              <wp:inline distT="0" distB="0" distL="0" distR="0" wp14:anchorId="0C975305" wp14:editId="2458A6BB">
+              <wp:inline distT="0" distB="0" distL="0" distR="0" wp14:anchorId="7971F684" wp14:editId="240B1539">
                 <wp:extent cx="1524000" cy="482851"/>
                 <wp:effectExtent l="0" t="0" r="0" b="0"/>
                 <wp:docPr id="402729602" name="Picture 1"/>
@@ -5402,7 +4021,7 @@
       <mc:AlternateContent>
         <mc:Choice Requires="wps">
           <w:drawing>
-            <wp:anchor distT="0" distB="0" distL="114300" distR="114300" simplePos="0" relativeHeight="251658240" behindDoc="0" locked="0" layoutInCell="1" allowOverlap="1" wp14:anchorId="78012B72" wp14:editId="5FECBA9C">
+            <wp:anchor distT="0" distB="0" distL="114300" distR="114300" simplePos="0" relativeHeight="251658240" behindDoc="0" locked="0" layoutInCell="1" allowOverlap="1" wp14:anchorId="5839FB81" wp14:editId="43726EDC">
               <wp:simplePos x="0" y="0"/>
               <wp:positionH relativeFrom="column">
                 <wp:posOffset>-946150</wp:posOffset>
@@ -5480,7 +4099,7 @@
         <w:szCs w:val="22"/>
       </w:rPr>
       <w:drawing>
-        <wp:anchor distT="0" distB="0" distL="114300" distR="114300" simplePos="0" relativeHeight="251661312" behindDoc="0" locked="0" layoutInCell="1" allowOverlap="1" wp14:anchorId="17BFD8CD" wp14:editId="35ECFA0E">
+        <wp:anchor distT="0" distB="0" distL="114300" distR="114300" simplePos="0" relativeHeight="251661312" behindDoc="0" locked="0" layoutInCell="1" allowOverlap="1" wp14:anchorId="1813D673" wp14:editId="4C16BC2A">
           <wp:simplePos x="0" y="0"/>
           <wp:positionH relativeFrom="column">
             <wp:posOffset>9591675</wp:posOffset>
@@ -5562,7 +4181,7 @@
       <mc:AlternateContent>
         <mc:Choice Requires="wps">
           <w:drawing>
-            <wp:anchor distT="0" distB="0" distL="114300" distR="114300" simplePos="0" relativeHeight="251662336" behindDoc="0" locked="0" layoutInCell="1" allowOverlap="1" wp14:anchorId="5F41ACCC" wp14:editId="758EF369">
+            <wp:anchor distT="0" distB="0" distL="114300" distR="114300" simplePos="0" relativeHeight="251662336" behindDoc="0" locked="0" layoutInCell="1" allowOverlap="1" wp14:anchorId="1F3D6E8D" wp14:editId="12C6E227">
               <wp:simplePos x="0" y="0"/>
               <wp:positionH relativeFrom="column">
                 <wp:posOffset>8305800</wp:posOffset>
@@ -5611,6 +4230,7 @@
                               <w:kern w:val="24"/>
                             </w:rPr>
                           </w:pPr>
+                          <w:proofErr w:type="gramStart"/>
                           <w:r>
                             <w:rPr>
                               <w:rFonts w:ascii="Nirmala Text" w:eastAsia="Nirmala Text" w:hAnsi="Nirmala Text" w:cs="Nirmala Text"/>
@@ -5619,7 +4239,18 @@
                               <w:color w:val="F6DD23"/>
                               <w:kern w:val="24"/>
                             </w:rPr>
-                            <w:t>TLP:AMBER+STRICT</w:t>
+                            <w:t>TLP:AMBER</w:t>
+                          </w:r>
+                          <w:proofErr w:type="gramEnd"/>
+                          <w:r>
+                            <w:rPr>
+                              <w:rFonts w:ascii="Nirmala Text" w:eastAsia="Nirmala Text" w:hAnsi="Nirmala Text" w:cs="Nirmala Text"/>
+                              <w:b/>
+                              <w:bCs/>
+                              <w:color w:val="F6DD23"/>
+                              <w:kern w:val="24"/>
+                            </w:rPr>
+                            <w:t>+STRICT</w:t>
                           </w:r>
                         </w:p>
                       </w:txbxContent>
@@ -10220,21 +8851,6 @@
 </file>
 
 <file path=customXml/item2.xml><?xml version="1.0" encoding="utf-8"?>
-<p:properties xmlns:p="http://schemas.microsoft.com/office/2006/metadata/properties" xmlns:xsi="http://www.w3.org/2001/XMLSchema-instance" xmlns:pc="http://schemas.microsoft.com/office/infopath/2007/PartnerControls">
-  <documentManagement>
-    <lcf76f155ced4ddcb4097134ff3c332f xmlns="afb72fb5-58d3-46e0-8b83-6204a9ccb897">
-      <Terms xmlns="http://schemas.microsoft.com/office/infopath/2007/PartnerControls"/>
-    </lcf76f155ced4ddcb4097134ff3c332f>
-    <TaxCatchAll xmlns="7eeb797a-e46d-47e3-9f8b-1124477eb690" xsi:nil="true"/>
-  </documentManagement>
-</p:properties>
-</file>
-
-<file path=customXml/item3.xml><?xml version="1.0" encoding="utf-8"?>
-<b:Sources xmlns:b="http://schemas.openxmlformats.org/officeDocument/2006/bibliography" xmlns="http://schemas.openxmlformats.org/officeDocument/2006/bibliography" SelectedStyle="/APASixthEditionOfficeOnline.xsl" StyleName="APA" Version="6"/>
-</file>
-
-<file path=customXml/item4.xml><?xml version="1.0" encoding="utf-8"?>
 <ct:contentTypeSchema xmlns:ct="http://schemas.microsoft.com/office/2006/metadata/contentType" xmlns:ma="http://schemas.microsoft.com/office/2006/metadata/properties/metaAttributes" ct:_="" ma:_="" ma:contentTypeName="Document" ma:contentTypeID="0x010100AFCF4B2913B96A488E0F743192725261" ma:contentTypeVersion="10" ma:contentTypeDescription="Create a new document." ma:contentTypeScope="" ma:versionID="2a3907d622944450d873795b62bd3fd1">
   <xsd:schema xmlns:xsd="http://www.w3.org/2001/XMLSchema" xmlns:xs="http://www.w3.org/2001/XMLSchema" xmlns:p="http://schemas.microsoft.com/office/2006/metadata/properties" xmlns:ns2="afb72fb5-58d3-46e0-8b83-6204a9ccb897" xmlns:ns3="7eeb797a-e46d-47e3-9f8b-1124477eb690" targetNamespace="http://schemas.microsoft.com/office/2006/metadata/properties" ma:root="true" ma:fieldsID="95604d8cadeb01aab63de2737106632d" ns2:_="" ns3:_="">
     <xsd:import namespace="afb72fb5-58d3-46e0-8b83-6204a9ccb897"/>
@@ -10423,6 +9039,21 @@
 </ct:contentTypeSchema>
 </file>
 
+<file path=customXml/item3.xml><?xml version="1.0" encoding="utf-8"?>
+<b:Sources xmlns:b="http://schemas.openxmlformats.org/officeDocument/2006/bibliography" xmlns="http://schemas.openxmlformats.org/officeDocument/2006/bibliography" SelectedStyle="/APASixthEditionOfficeOnline.xsl" StyleName="APA" Version="6"/>
+</file>
+
+<file path=customXml/item4.xml><?xml version="1.0" encoding="utf-8"?>
+<p:properties xmlns:p="http://schemas.microsoft.com/office/2006/metadata/properties" xmlns:xsi="http://www.w3.org/2001/XMLSchema-instance" xmlns:pc="http://schemas.microsoft.com/office/infopath/2007/PartnerControls">
+  <documentManagement>
+    <lcf76f155ced4ddcb4097134ff3c332f xmlns="afb72fb5-58d3-46e0-8b83-6204a9ccb897">
+      <Terms xmlns="http://schemas.microsoft.com/office/infopath/2007/PartnerControls"/>
+    </lcf76f155ced4ddcb4097134ff3c332f>
+    <TaxCatchAll xmlns="7eeb797a-e46d-47e3-9f8b-1124477eb690" xsi:nil="true"/>
+  </documentManagement>
+</p:properties>
+</file>
+
 <file path=customXml/itemProps1.xml><?xml version="1.0" encoding="utf-8"?>
 <ds:datastoreItem xmlns:ds="http://schemas.openxmlformats.org/officeDocument/2006/customXml" ds:itemID="{4C9DE648-81B7-4867-9DBA-8D42A681444E}">
   <ds:schemaRefs>
@@ -10432,25 +9063,6 @@
 </file>
 
 <file path=customXml/itemProps2.xml><?xml version="1.0" encoding="utf-8"?>
-<ds:datastoreItem xmlns:ds="http://schemas.openxmlformats.org/officeDocument/2006/customXml" ds:itemID="{9B00A5AB-C3F4-4CD2-AAC1-F40B6DF48AEE}">
-  <ds:schemaRefs>
-    <ds:schemaRef ds:uri="http://schemas.microsoft.com/office/2006/metadata/properties"/>
-    <ds:schemaRef ds:uri="http://schemas.microsoft.com/office/infopath/2007/PartnerControls"/>
-    <ds:schemaRef ds:uri="afb72fb5-58d3-46e0-8b83-6204a9ccb897"/>
-    <ds:schemaRef ds:uri="7eeb797a-e46d-47e3-9f8b-1124477eb690"/>
-  </ds:schemaRefs>
-</ds:datastoreItem>
-</file>
-
-<file path=customXml/itemProps3.xml><?xml version="1.0" encoding="utf-8"?>
-<ds:datastoreItem xmlns:ds="http://schemas.openxmlformats.org/officeDocument/2006/customXml" ds:itemID="{019324B5-EF86-1D45-B65C-69FFDDC5F259}">
-  <ds:schemaRefs>
-    <ds:schemaRef ds:uri="http://schemas.openxmlformats.org/officeDocument/2006/bibliography"/>
-  </ds:schemaRefs>
-</ds:datastoreItem>
-</file>
-
-<file path=customXml/itemProps4.xml><?xml version="1.0" encoding="utf-8"?>
 <ds:datastoreItem xmlns:ds="http://schemas.openxmlformats.org/officeDocument/2006/customXml" ds:itemID="{3BB6F7E9-CC77-46A3-8137-2A102AA86487}">
   <ds:schemaRefs>
     <ds:schemaRef ds:uri="http://schemas.microsoft.com/office/2006/metadata/contentType"/>
@@ -10469,6 +9081,25 @@
 </ds:datastoreItem>
 </file>
 
+<file path=customXml/itemProps3.xml><?xml version="1.0" encoding="utf-8"?>
+<ds:datastoreItem xmlns:ds="http://schemas.openxmlformats.org/officeDocument/2006/customXml" ds:itemID="{019324B5-EF86-1D45-B65C-69FFDDC5F259}">
+  <ds:schemaRefs>
+    <ds:schemaRef ds:uri="http://schemas.openxmlformats.org/officeDocument/2006/bibliography"/>
+  </ds:schemaRefs>
+</ds:datastoreItem>
+</file>
+
+<file path=customXml/itemProps4.xml><?xml version="1.0" encoding="utf-8"?>
+<ds:datastoreItem xmlns:ds="http://schemas.openxmlformats.org/officeDocument/2006/customXml" ds:itemID="{9B00A5AB-C3F4-4CD2-AAC1-F40B6DF48AEE}">
+  <ds:schemaRefs>
+    <ds:schemaRef ds:uri="http://schemas.microsoft.com/office/2006/metadata/properties"/>
+    <ds:schemaRef ds:uri="http://schemas.microsoft.com/office/infopath/2007/PartnerControls"/>
+    <ds:schemaRef ds:uri="afb72fb5-58d3-46e0-8b83-6204a9ccb897"/>
+    <ds:schemaRef ds:uri="7eeb797a-e46d-47e3-9f8b-1124477eb690"/>
+  </ds:schemaRefs>
+</ds:datastoreItem>
+</file>
+
 <file path=docMetadata/LabelInfo.xml><?xml version="1.0" encoding="utf-8"?>
 <clbl:labelList xmlns:clbl="http://schemas.microsoft.com/office/2020/mipLabelMetadata">
   <clbl:label id="{d58addea-5053-4a80-8499-ba4d944910df}" enabled="0" method="" siteId="{d58addea-5053-4a80-8499-ba4d944910df}" removed="1"/>

</xml_diff>